<commit_message>
refactor: update student name to Rumman Islam and standardize course to Data Science
</commit_message>
<xml_diff>
--- a/DS_LAB_REPORT.docx
+++ b/DS_LAB_REPORT.docx
@@ -4,131 +4,193 @@
   <w:body>
     <w:p>
       <w:pPr>
-        <w:pStyle w:val="Title"/>
-        <w:jc w:val="center"/>
+        <w:spacing w:before="360" w:after="160"/>
       </w:pPr>
       <w:r>
+        <w:rPr>
+          <w:b/>
+          <w:color w:val="1A365D"/>
+          <w:sz w:val="40"/>
+        </w:rPr>
         <w:t>Data Science Lab Report</w:t>
       </w:r>
     </w:p>
     <w:p>
       <w:pPr>
-        <w:jc w:val="center"/>
+        <w:spacing w:after="120"/>
+      </w:pPr>
+      <w:r/>
+      <w:r>
+        <w:rPr>
+          <w:b/>
+        </w:rPr>
+        <w:t>Title:</w:t>
+      </w:r>
+      <w:r>
+        <w:t xml:space="preserve"> Breast Cancer Diagnosis Using Logistic Regression</w:t>
+      </w:r>
+    </w:p>
+    <w:p>
+      <w:pPr>
+        <w:spacing w:after="120"/>
+      </w:pPr>
+      <w:r/>
+      <w:r>
+        <w:rPr>
+          <w:b/>
+        </w:rPr>
+        <w:t>Dataset:</w:t>
+      </w:r>
+      <w:r>
+        <w:t xml:space="preserve"> Breast Cancer Wisconsin Diagnostic Dataset</w:t>
+      </w:r>
+    </w:p>
+    <w:p>
+      <w:pPr>
+        <w:spacing w:after="120"/>
+      </w:pPr>
+      <w:r/>
+      <w:r>
+        <w:rPr>
+          <w:b/>
+        </w:rPr>
+        <w:t>Student:</w:t>
+      </w:r>
+      <w:r>
+        <w:t xml:space="preserve"> Rumman Islam</w:t>
+      </w:r>
+    </w:p>
+    <w:p>
+      <w:pPr>
+        <w:spacing w:after="120"/>
+      </w:pPr>
+      <w:r/>
+      <w:r>
+        <w:rPr>
+          <w:b/>
+        </w:rPr>
+        <w:t>Tool:</w:t>
+      </w:r>
+      <w:r>
+        <w:t xml:space="preserve"> Python 3 · Pandas · Scikit-learn · Seaborn · Matplotlib · Jupyter</w:t>
+      </w:r>
+    </w:p>
+    <w:p>
+      <w:pPr>
+        <w:spacing w:after="120"/>
+      </w:pPr>
+      <w:r/>
+      <w:r>
+        <w:rPr>
+          <w:b/>
+        </w:rPr>
+        <w:t>Date:</w:t>
+      </w:r>
+      <w:r>
+        <w:t xml:space="preserve"> September 2026</w:t>
+      </w:r>
+    </w:p>
+    <w:p>
+      <w:pPr>
+        <w:spacing w:before="280" w:after="120"/>
       </w:pPr>
       <w:r>
         <w:rPr>
           <w:b/>
+          <w:color w:val="2B6CB0"/>
+          <w:sz w:val="30"/>
         </w:rPr>
-        <w:t>Breast Cancer Diagnosis Using Logistic Regression</w:t>
-        <w:br/>
+        <w:t>1. Problem Statement</w:t>
       </w:r>
     </w:p>
     <w:p>
       <w:pPr>
-        <w:jc w:val="center"/>
+        <w:spacing w:after="120"/>
+      </w:pPr>
+      <w:r>
+        <w:t xml:space="preserve">Breast cancer is one of the most prevalent and life-threatening cancers worldwide. Early and accurate detection significantly improves patient survival rates. Manual diagnosis from fine needle aspirate (FNA) biopsy images is time-consuming and error-prone. This study aims to build a </w:t>
+      </w:r>
+      <w:r>
+        <w:rPr>
+          <w:b/>
+        </w:rPr>
+        <w:t>Logistic Regression classification model</w:t>
+      </w:r>
+      <w:r>
+        <w:t xml:space="preserve"> to predict whether a tumor is </w:t>
+      </w:r>
+      <w:r>
+        <w:rPr>
+          <w:b/>
+        </w:rPr>
+        <w:t>Malignant (M)</w:t>
+      </w:r>
+      <w:r>
+        <w:t xml:space="preserve"> or </w:t>
+      </w:r>
+      <w:r>
+        <w:rPr>
+          <w:b/>
+        </w:rPr>
+        <w:t>Benign (B)</w:t>
+      </w:r>
+      <w:r>
+        <w:t xml:space="preserve"> based on measurable cell nucleus features extracted from FNA images — enabling automated, reliable diagnostic support.</w:t>
+      </w:r>
+    </w:p>
+    <w:p>
+      <w:pPr>
+        <w:spacing w:after="120"/>
+      </w:pPr>
+      <w:r/>
+      <w:r>
+        <w:rPr>
+          <w:b/>
+        </w:rPr>
+        <w:t>Research Question:</w:t>
+      </w:r>
+      <w:r>
+        <w:t xml:space="preserve"> Can Logistic Regression classify breast tumor malignancy with high accuracy and precision using cell nucleus measurements?</w:t>
+      </w:r>
+    </w:p>
+    <w:p>
+      <w:pPr>
+        <w:spacing w:before="280" w:after="120"/>
       </w:pPr>
       <w:r>
         <w:rPr>
           <w:b/>
+          <w:color w:val="2B6CB0"/>
+          <w:sz w:val="30"/>
         </w:rPr>
-        <w:t xml:space="preserve">Student: </w:t>
-      </w:r>
-      <w:r>
-        <w:t>Rumman Khatun</w:t>
-      </w:r>
-    </w:p>
-    <w:p>
-      <w:pPr>
-        <w:jc w:val="center"/>
-      </w:pPr>
-      <w:r>
-        <w:rPr>
-          <w:b/>
-        </w:rPr>
-        <w:t xml:space="preserve">Dataset: </w:t>
-      </w:r>
-      <w:r>
-        <w:t>Breast Cancer Wisconsin Diagnostic Dataset</w:t>
-      </w:r>
-    </w:p>
-    <w:p>
-      <w:pPr>
-        <w:jc w:val="center"/>
-      </w:pPr>
-      <w:r>
-        <w:rPr>
-          <w:b/>
-        </w:rPr>
-        <w:t xml:space="preserve">Tool: </w:t>
-      </w:r>
-      <w:r>
-        <w:t>Python 3 · Pandas · Scikit-learn · Seaborn · Matplotlib</w:t>
-      </w:r>
-    </w:p>
-    <w:p>
-      <w:pPr>
-        <w:jc w:val="center"/>
-      </w:pPr>
-      <w:r>
-        <w:rPr>
-          <w:b/>
-        </w:rPr>
-        <w:t xml:space="preserve">Date: </w:t>
-      </w:r>
-      <w:r>
-        <w:t>September 2026</w:t>
-      </w:r>
-    </w:p>
-    <w:p>
-      <w:r>
-        <w:br w:type="page"/>
-      </w:r>
-    </w:p>
-    <w:p>
-      <w:pPr>
-        <w:pStyle w:val="Heading1"/>
-      </w:pPr>
-      <w:r>
-        <w:t>1. Problem Statement</w:t>
-      </w:r>
-    </w:p>
-    <w:p>
-      <w:r>
-        <w:t>Breast cancer is one of the most prevalent cancers worldwide. Early and accurate detection significantly improves patient survival rates. Manual diagnosis from FNA biopsy images is time-consuming and error-prone. This study builds a Logistic Regression classification model to predict whether a tumor is Malignant (M) or Benign (B) based on measurable cell nucleus features — enabling automated, reliable diagnostic support.</w:t>
-        <w:br/>
-        <w:br/>
-        <w:t>Research Question: Can Logistic Regression classify breast tumor malignancy with high accuracy and precision using cell nucleus measurements?</w:t>
-      </w:r>
-    </w:p>
-    <w:p>
-      <w:pPr>
-        <w:pStyle w:val="Heading1"/>
-      </w:pPr>
-      <w:r>
         <w:t>2. Data Source</w:t>
       </w:r>
     </w:p>
     <w:tbl>
       <w:tblPr>
-        <w:tblStyle w:val="TableGrid"/>
         <w:tblW w:type="auto" w:w="0"/>
+        <w:jc w:val="center"/>
         <w:tblLook w:firstColumn="1" w:firstRow="1" w:lastColumn="0" w:lastRow="0" w:noHBand="0" w:noVBand="1" w:val="04A0"/>
       </w:tblPr>
       <w:tblGrid>
-        <w:gridCol w:w="4533"/>
-        <w:gridCol w:w="4533"/>
+        <w:gridCol w:w="4680"/>
+        <w:gridCol w:w="4680"/>
       </w:tblGrid>
       <w:tr>
         <w:tc>
           <w:tcPr>
-            <w:tcW w:type="dxa" w:w="4533"/>
-            <w:shd w:val="clear" w:color="auto" w:fill="1F77B4"/>
+            <w:tcW w:type="dxa" w:w="4680"/>
+            <w:shd w:val="clear" w:color="auto" w:fill="2B6CB0"/>
           </w:tcPr>
           <w:p>
+            <w:pPr>
+              <w:spacing w:before="80" w:after="80"/>
+            </w:pPr>
             <w:r>
               <w:rPr>
                 <w:b/>
                 <w:color w:val="FFFFFF"/>
+                <w:sz w:val="20"/>
               </w:rPr>
               <w:t>Item</w:t>
             </w:r>
@@ -136,14 +198,18 @@
         </w:tc>
         <w:tc>
           <w:tcPr>
-            <w:tcW w:type="dxa" w:w="4533"/>
-            <w:shd w:val="clear" w:color="auto" w:fill="1F77B4"/>
+            <w:tcW w:type="dxa" w:w="4680"/>
+            <w:shd w:val="clear" w:color="auto" w:fill="2B6CB0"/>
           </w:tcPr>
           <w:p>
+            <w:pPr>
+              <w:spacing w:before="80" w:after="80"/>
+            </w:pPr>
             <w:r>
               <w:rPr>
                 <w:b/>
                 <w:color w:val="FFFFFF"/>
+                <w:sz w:val="20"/>
               </w:rPr>
               <w:t>Details</w:t>
             </w:r>
@@ -153,22 +219,32 @@
       <w:tr>
         <w:tc>
           <w:tcPr>
-            <w:tcW w:type="dxa" w:w="4533"/>
-            <w:shd w:val="clear" w:color="auto" w:fill="E8F4FD"/>
+            <w:tcW w:type="dxa" w:w="4680"/>
           </w:tcPr>
           <w:p>
+            <w:pPr>
+              <w:spacing w:before="80" w:after="80"/>
+            </w:pPr>
             <w:r>
+              <w:rPr>
+                <w:sz w:val="19"/>
+              </w:rPr>
               <w:t>Dataset Name</w:t>
             </w:r>
           </w:p>
         </w:tc>
         <w:tc>
           <w:tcPr>
-            <w:tcW w:type="dxa" w:w="4533"/>
-            <w:shd w:val="clear" w:color="auto" w:fill="E8F4FD"/>
+            <w:tcW w:type="dxa" w:w="4680"/>
           </w:tcPr>
           <w:p>
+            <w:pPr>
+              <w:spacing w:before="80" w:after="80"/>
+            </w:pPr>
             <w:r>
+              <w:rPr>
+                <w:sz w:val="19"/>
+              </w:rPr>
               <w:t>Breast Cancer Wisconsin Diagnostic Dataset</w:t>
             </w:r>
           </w:p>
@@ -177,20 +253,34 @@
       <w:tr>
         <w:tc>
           <w:tcPr>
-            <w:tcW w:type="dxa" w:w="4533"/>
+            <w:tcW w:type="dxa" w:w="4680"/>
+            <w:shd w:val="clear" w:color="auto" w:fill="F7FAFC"/>
           </w:tcPr>
           <w:p>
+            <w:pPr>
+              <w:spacing w:before="80" w:after="80"/>
+            </w:pPr>
             <w:r>
+              <w:rPr>
+                <w:sz w:val="19"/>
+              </w:rPr>
               <w:t>Source</w:t>
             </w:r>
           </w:p>
         </w:tc>
         <w:tc>
           <w:tcPr>
-            <w:tcW w:type="dxa" w:w="4533"/>
+            <w:tcW w:type="dxa" w:w="4680"/>
+            <w:shd w:val="clear" w:color="auto" w:fill="F7FAFC"/>
           </w:tcPr>
           <w:p>
+            <w:pPr>
+              <w:spacing w:before="80" w:after="80"/>
+            </w:pPr>
             <w:r>
+              <w:rPr>
+                <w:sz w:val="19"/>
+              </w:rPr>
               <w:t>Kaggle — mehmetisik/breast-cancercsv</w:t>
             </w:r>
           </w:p>
@@ -199,22 +289,32 @@
       <w:tr>
         <w:tc>
           <w:tcPr>
-            <w:tcW w:type="dxa" w:w="4533"/>
-            <w:shd w:val="clear" w:color="auto" w:fill="E8F4FD"/>
+            <w:tcW w:type="dxa" w:w="4680"/>
           </w:tcPr>
           <w:p>
+            <w:pPr>
+              <w:spacing w:before="80" w:after="80"/>
+            </w:pPr>
             <w:r>
+              <w:rPr>
+                <w:sz w:val="19"/>
+              </w:rPr>
               <w:t>Original Records</w:t>
             </w:r>
           </w:p>
         </w:tc>
         <w:tc>
           <w:tcPr>
-            <w:tcW w:type="dxa" w:w="4533"/>
-            <w:shd w:val="clear" w:color="auto" w:fill="E8F4FD"/>
+            <w:tcW w:type="dxa" w:w="4680"/>
           </w:tcPr>
           <w:p>
+            <w:pPr>
+              <w:spacing w:before="80" w:after="80"/>
+            </w:pPr>
             <w:r>
+              <w:rPr>
+                <w:sz w:val="19"/>
+              </w:rPr>
               <w:t>569 samples</w:t>
             </w:r>
           </w:p>
@@ -223,21 +323,35 @@
       <w:tr>
         <w:tc>
           <w:tcPr>
-            <w:tcW w:type="dxa" w:w="4533"/>
+            <w:tcW w:type="dxa" w:w="4680"/>
+            <w:shd w:val="clear" w:color="auto" w:fill="F7FAFC"/>
           </w:tcPr>
           <w:p>
+            <w:pPr>
+              <w:spacing w:before="80" w:after="80"/>
+            </w:pPr>
             <w:r>
+              <w:rPr>
+                <w:sz w:val="19"/>
+              </w:rPr>
               <w:t>Augmented Records</w:t>
             </w:r>
           </w:p>
         </w:tc>
         <w:tc>
           <w:tcPr>
-            <w:tcW w:type="dxa" w:w="4533"/>
+            <w:tcW w:type="dxa" w:w="4680"/>
+            <w:shd w:val="clear" w:color="auto" w:fill="F7FAFC"/>
           </w:tcPr>
           <w:p>
+            <w:pPr>
+              <w:spacing w:before="80" w:after="80"/>
+            </w:pPr>
             <w:r>
-              <w:t>1,138 records (duplicated to meet ≥ 1,000 requirement)</w:t>
+              <w:rPr>
+                <w:sz w:val="19"/>
+              </w:rPr>
+              <w:t>1,138 records (duplicated to meet ≥ 1,000 row requirement)</w:t>
             </w:r>
           </w:p>
         </w:tc>
@@ -245,23 +359,33 @@
       <w:tr>
         <w:tc>
           <w:tcPr>
-            <w:tcW w:type="dxa" w:w="4533"/>
-            <w:shd w:val="clear" w:color="auto" w:fill="E8F4FD"/>
+            <w:tcW w:type="dxa" w:w="4680"/>
           </w:tcPr>
           <w:p>
+            <w:pPr>
+              <w:spacing w:before="80" w:after="80"/>
+            </w:pPr>
             <w:r>
+              <w:rPr>
+                <w:sz w:val="19"/>
+              </w:rPr>
               <w:t>Total Features</w:t>
             </w:r>
           </w:p>
         </w:tc>
         <w:tc>
           <w:tcPr>
-            <w:tcW w:type="dxa" w:w="4533"/>
-            <w:shd w:val="clear" w:color="auto" w:fill="E8F4FD"/>
+            <w:tcW w:type="dxa" w:w="4680"/>
           </w:tcPr>
           <w:p>
+            <w:pPr>
+              <w:spacing w:before="80" w:after="80"/>
+            </w:pPr>
             <w:r>
-              <w:t>31 columns (30 numerical + 1 target)</w:t>
+              <w:rPr>
+                <w:sz w:val="19"/>
+              </w:rPr>
+              <w:t>31 columns (30 numerical features + 1 target)</w:t>
             </w:r>
           </w:p>
         </w:tc>
@@ -269,21 +393,35 @@
       <w:tr>
         <w:tc>
           <w:tcPr>
-            <w:tcW w:type="dxa" w:w="4533"/>
+            <w:tcW w:type="dxa" w:w="4680"/>
+            <w:shd w:val="clear" w:color="auto" w:fill="F7FAFC"/>
           </w:tcPr>
           <w:p>
+            <w:pPr>
+              <w:spacing w:before="80" w:after="80"/>
+            </w:pPr>
             <w:r>
+              <w:rPr>
+                <w:sz w:val="19"/>
+              </w:rPr>
               <w:t>Target Variable</w:t>
             </w:r>
           </w:p>
         </w:tc>
         <w:tc>
           <w:tcPr>
-            <w:tcW w:type="dxa" w:w="4533"/>
+            <w:tcW w:type="dxa" w:w="4680"/>
+            <w:shd w:val="clear" w:color="auto" w:fill="F7FAFC"/>
           </w:tcPr>
           <w:p>
+            <w:pPr>
+              <w:spacing w:before="80" w:after="80"/>
+            </w:pPr>
             <w:r>
-              <w:t>diagnosis — M (Malignant=1) / B (Benign=0)</w:t>
+              <w:rPr>
+                <w:sz w:val="19"/>
+              </w:rPr>
+              <w:t>diagnosis — M (Malignant = 1) / B (Benign = 0)</w:t>
             </w:r>
           </w:p>
         </w:tc>
@@ -291,22 +429,32 @@
       <w:tr>
         <w:tc>
           <w:tcPr>
-            <w:tcW w:type="dxa" w:w="4533"/>
-            <w:shd w:val="clear" w:color="auto" w:fill="E8F4FD"/>
+            <w:tcW w:type="dxa" w:w="4680"/>
           </w:tcPr>
           <w:p>
+            <w:pPr>
+              <w:spacing w:before="80" w:after="80"/>
+            </w:pPr>
             <w:r>
+              <w:rPr>
+                <w:sz w:val="19"/>
+              </w:rPr>
               <w:t>Missing Values</w:t>
             </w:r>
           </w:p>
         </w:tc>
         <w:tc>
           <w:tcPr>
-            <w:tcW w:type="dxa" w:w="4533"/>
-            <w:shd w:val="clear" w:color="auto" w:fill="E8F4FD"/>
+            <w:tcW w:type="dxa" w:w="4680"/>
           </w:tcPr>
           <w:p>
+            <w:pPr>
+              <w:spacing w:before="80" w:after="80"/>
+            </w:pPr>
             <w:r>
+              <w:rPr>
+                <w:sz w:val="19"/>
+              </w:rPr>
               <w:t>0 (100% complete)</w:t>
             </w:r>
           </w:p>
@@ -315,20 +463,34 @@
       <w:tr>
         <w:tc>
           <w:tcPr>
-            <w:tcW w:type="dxa" w:w="4533"/>
+            <w:tcW w:type="dxa" w:w="4680"/>
+            <w:shd w:val="clear" w:color="auto" w:fill="F7FAFC"/>
           </w:tcPr>
           <w:p>
+            <w:pPr>
+              <w:spacing w:before="80" w:after="80"/>
+            </w:pPr>
             <w:r>
-              <w:t>Tool</w:t>
+              <w:rPr>
+                <w:sz w:val="19"/>
+              </w:rPr>
+              <w:t>Tool / Environment</w:t>
             </w:r>
           </w:p>
         </w:tc>
         <w:tc>
           <w:tcPr>
-            <w:tcW w:type="dxa" w:w="4533"/>
+            <w:tcW w:type="dxa" w:w="4680"/>
+            <w:shd w:val="clear" w:color="auto" w:fill="F7FAFC"/>
           </w:tcPr>
           <w:p>
+            <w:pPr>
+              <w:spacing w:before="80" w:after="80"/>
+            </w:pPr>
             <w:r>
+              <w:rPr>
+                <w:sz w:val="19"/>
+              </w:rPr>
               <w:t>Python 3, Pandas, Scikit-learn, Jupyter Notebook</w:t>
             </w:r>
           </w:p>
@@ -338,42 +500,56 @@
     <w:p/>
     <w:p>
       <w:pPr>
-        <w:pStyle w:val="Heading1"/>
+        <w:spacing w:before="280" w:after="120"/>
       </w:pPr>
       <w:r>
+        <w:rPr>
+          <w:b/>
+          <w:color w:val="2B6CB0"/>
+          <w:sz w:val="30"/>
+        </w:rPr>
         <w:t>3. Analysis</w:t>
       </w:r>
     </w:p>
     <w:p>
       <w:pPr>
-        <w:pStyle w:val="Heading2"/>
+        <w:spacing w:before="200" w:after="80"/>
       </w:pPr>
       <w:r>
+        <w:rPr>
+          <w:b/>
+          <w:color w:val="2D3748"/>
+          <w:sz w:val="24"/>
+        </w:rPr>
         <w:t>3.1 Class Distribution</w:t>
       </w:r>
     </w:p>
     <w:tbl>
       <w:tblPr>
-        <w:tblStyle w:val="TableGrid"/>
         <w:tblW w:type="auto" w:w="0"/>
+        <w:jc w:val="center"/>
         <w:tblLook w:firstColumn="1" w:firstRow="1" w:lastColumn="0" w:lastRow="0" w:noHBand="0" w:noVBand="1" w:val="04A0"/>
       </w:tblPr>
       <w:tblGrid>
-        <w:gridCol w:w="3022"/>
-        <w:gridCol w:w="3022"/>
-        <w:gridCol w:w="3022"/>
+        <w:gridCol w:w="3120"/>
+        <w:gridCol w:w="3120"/>
+        <w:gridCol w:w="3120"/>
       </w:tblGrid>
       <w:tr>
         <w:tc>
           <w:tcPr>
-            <w:tcW w:type="dxa" w:w="3022"/>
-            <w:shd w:val="clear" w:color="auto" w:fill="1F77B4"/>
+            <w:tcW w:type="dxa" w:w="3120"/>
+            <w:shd w:val="clear" w:color="auto" w:fill="2B6CB0"/>
           </w:tcPr>
           <w:p>
+            <w:pPr>
+              <w:spacing w:before="80" w:after="80"/>
+            </w:pPr>
             <w:r>
               <w:rPr>
                 <w:b/>
                 <w:color w:val="FFFFFF"/>
+                <w:sz w:val="20"/>
               </w:rPr>
               <w:t>Class</w:t>
             </w:r>
@@ -381,14 +557,18 @@
         </w:tc>
         <w:tc>
           <w:tcPr>
-            <w:tcW w:type="dxa" w:w="3022"/>
-            <w:shd w:val="clear" w:color="auto" w:fill="1F77B4"/>
+            <w:tcW w:type="dxa" w:w="3120"/>
+            <w:shd w:val="clear" w:color="auto" w:fill="2B6CB0"/>
           </w:tcPr>
           <w:p>
+            <w:pPr>
+              <w:spacing w:before="80" w:after="80"/>
+            </w:pPr>
             <w:r>
               <w:rPr>
                 <w:b/>
                 <w:color w:val="FFFFFF"/>
+                <w:sz w:val="20"/>
               </w:rPr>
               <w:t>Count</w:t>
             </w:r>
@@ -396,14 +576,18 @@
         </w:tc>
         <w:tc>
           <w:tcPr>
-            <w:tcW w:type="dxa" w:w="3022"/>
-            <w:shd w:val="clear" w:color="auto" w:fill="1F77B4"/>
+            <w:tcW w:type="dxa" w:w="3120"/>
+            <w:shd w:val="clear" w:color="auto" w:fill="2B6CB0"/>
           </w:tcPr>
           <w:p>
+            <w:pPr>
+              <w:spacing w:before="80" w:after="80"/>
+            </w:pPr>
             <w:r>
               <w:rPr>
                 <w:b/>
                 <w:color w:val="FFFFFF"/>
+                <w:sz w:val="20"/>
               </w:rPr>
               <w:t>Percentage</w:t>
             </w:r>
@@ -413,33 +597,48 @@
       <w:tr>
         <w:tc>
           <w:tcPr>
-            <w:tcW w:type="dxa" w:w="3022"/>
-            <w:shd w:val="clear" w:color="auto" w:fill="E8F4FD"/>
+            <w:tcW w:type="dxa" w:w="3120"/>
           </w:tcPr>
           <w:p>
+            <w:pPr>
+              <w:spacing w:before="80" w:after="80"/>
+            </w:pPr>
             <w:r>
+              <w:rPr>
+                <w:sz w:val="19"/>
+              </w:rPr>
               <w:t>Benign (B)</w:t>
             </w:r>
           </w:p>
         </w:tc>
         <w:tc>
           <w:tcPr>
-            <w:tcW w:type="dxa" w:w="3022"/>
-            <w:shd w:val="clear" w:color="auto" w:fill="E8F4FD"/>
+            <w:tcW w:type="dxa" w:w="3120"/>
           </w:tcPr>
           <w:p>
+            <w:pPr>
+              <w:spacing w:before="80" w:after="80"/>
+            </w:pPr>
             <w:r>
+              <w:rPr>
+                <w:sz w:val="19"/>
+              </w:rPr>
               <w:t>714</w:t>
             </w:r>
           </w:p>
         </w:tc>
         <w:tc>
           <w:tcPr>
-            <w:tcW w:type="dxa" w:w="3022"/>
-            <w:shd w:val="clear" w:color="auto" w:fill="E8F4FD"/>
+            <w:tcW w:type="dxa" w:w="3120"/>
           </w:tcPr>
           <w:p>
+            <w:pPr>
+              <w:spacing w:before="80" w:after="80"/>
+            </w:pPr>
             <w:r>
+              <w:rPr>
+                <w:sz w:val="19"/>
+              </w:rPr>
               <w:t>62.7%</w:t>
             </w:r>
           </w:p>
@@ -448,30 +647,51 @@
       <w:tr>
         <w:tc>
           <w:tcPr>
-            <w:tcW w:type="dxa" w:w="3022"/>
+            <w:tcW w:type="dxa" w:w="3120"/>
+            <w:shd w:val="clear" w:color="auto" w:fill="F7FAFC"/>
           </w:tcPr>
           <w:p>
+            <w:pPr>
+              <w:spacing w:before="80" w:after="80"/>
+            </w:pPr>
             <w:r>
+              <w:rPr>
+                <w:sz w:val="19"/>
+              </w:rPr>
               <w:t>Malignant (M)</w:t>
             </w:r>
           </w:p>
         </w:tc>
         <w:tc>
           <w:tcPr>
-            <w:tcW w:type="dxa" w:w="3022"/>
+            <w:tcW w:type="dxa" w:w="3120"/>
+            <w:shd w:val="clear" w:color="auto" w:fill="F7FAFC"/>
           </w:tcPr>
           <w:p>
+            <w:pPr>
+              <w:spacing w:before="80" w:after="80"/>
+            </w:pPr>
             <w:r>
+              <w:rPr>
+                <w:sz w:val="19"/>
+              </w:rPr>
               <w:t>424</w:t>
             </w:r>
           </w:p>
         </w:tc>
         <w:tc>
           <w:tcPr>
-            <w:tcW w:type="dxa" w:w="3022"/>
+            <w:tcW w:type="dxa" w:w="3120"/>
+            <w:shd w:val="clear" w:color="auto" w:fill="F7FAFC"/>
           </w:tcPr>
           <w:p>
+            <w:pPr>
+              <w:spacing w:before="80" w:after="80"/>
+            </w:pPr>
             <w:r>
+              <w:rPr>
+                <w:sz w:val="19"/>
+              </w:rPr>
               <w:t>37.3%</w:t>
             </w:r>
           </w:p>
@@ -480,33 +700,48 @@
       <w:tr>
         <w:tc>
           <w:tcPr>
-            <w:tcW w:type="dxa" w:w="3022"/>
-            <w:shd w:val="clear" w:color="auto" w:fill="E8F4FD"/>
+            <w:tcW w:type="dxa" w:w="3120"/>
           </w:tcPr>
           <w:p>
+            <w:pPr>
+              <w:spacing w:before="80" w:after="80"/>
+            </w:pPr>
             <w:r>
+              <w:rPr>
+                <w:sz w:val="19"/>
+              </w:rPr>
               <w:t>Total</w:t>
             </w:r>
           </w:p>
         </w:tc>
         <w:tc>
           <w:tcPr>
-            <w:tcW w:type="dxa" w:w="3022"/>
-            <w:shd w:val="clear" w:color="auto" w:fill="E8F4FD"/>
+            <w:tcW w:type="dxa" w:w="3120"/>
           </w:tcPr>
           <w:p>
+            <w:pPr>
+              <w:spacing w:before="80" w:after="80"/>
+            </w:pPr>
             <w:r>
+              <w:rPr>
+                <w:sz w:val="19"/>
+              </w:rPr>
               <w:t>1,138</w:t>
             </w:r>
           </w:p>
         </w:tc>
         <w:tc>
           <w:tcPr>
-            <w:tcW w:type="dxa" w:w="3022"/>
-            <w:shd w:val="clear" w:color="auto" w:fill="E8F4FD"/>
+            <w:tcW w:type="dxa" w:w="3120"/>
           </w:tcPr>
           <w:p>
+            <w:pPr>
+              <w:spacing w:before="80" w:after="80"/>
+            </w:pPr>
             <w:r>
+              <w:rPr>
+                <w:sz w:val="19"/>
+              </w:rPr>
               <w:t>100%</w:t>
             </w:r>
           </w:p>
@@ -516,81 +751,135 @@
     <w:p/>
     <w:p>
       <w:pPr>
-        <w:pStyle w:val="Heading2"/>
+        <w:spacing w:after="120"/>
       </w:pPr>
       <w:r>
-        <w:t>3.2 Key EDA Findings</w:t>
+        <w:t>The dataset is slightly imbalanced (62.7% vs 37.3%). Precision and Recall are reported alongside Accuracy to account for this imbalance.</w:t>
+      </w:r>
+    </w:p>
+    <w:p>
+      <w:pPr>
+        <w:spacing w:before="200" w:after="80"/>
+      </w:pPr>
+      <w:r>
+        <w:rPr>
+          <w:b/>
+          <w:color w:val="2D3748"/>
+          <w:sz w:val="24"/>
+        </w:rPr>
+        <w:t>3.2 Key Findings from EDA</w:t>
       </w:r>
     </w:p>
     <w:p>
       <w:pPr>
         <w:pStyle w:val="ListBullet"/>
+        <w:spacing w:after="60"/>
       </w:pPr>
+      <w:r/>
       <w:r>
-        <w:t>No missing values across all 31 columns.</w:t>
+        <w:rPr>
+          <w:b/>
+        </w:rPr>
+        <w:t>No missing values</w:t>
+      </w:r>
+      <w:r>
+        <w:t xml:space="preserve"> across all 31 columns.</w:t>
       </w:r>
     </w:p>
     <w:p>
       <w:pPr>
         <w:pStyle w:val="ListBullet"/>
+        <w:spacing w:after="60"/>
       </w:pPr>
       <w:r>
-        <w:t>Malignant tumors consistently show higher radius_mean, area_mean, and perimeter_mean.</w:t>
+        <w:t xml:space="preserve">Malignant tumors consistently show </w:t>
+      </w:r>
+      <w:r>
+        <w:rPr>
+          <w:b/>
+        </w:rPr>
+        <w:t>higher</w:t>
+      </w:r>
+      <w:r>
+        <w:t xml:space="preserve"> `radius_mean`, `area_mean`, and `perimeter_mean`.</w:t>
       </w:r>
     </w:p>
     <w:p>
       <w:pPr>
         <w:pStyle w:val="ListBullet"/>
+        <w:spacing w:after="60"/>
       </w:pPr>
+      <w:r/>
       <w:r>
-        <w:t>Strong multicollinearity: radius_mean ↔ perimeter_mean (r &gt; 0.98) and radius_mean ↔ area_mean (r &gt; 0.98).</w:t>
+        <w:rPr>
+          <w:b/>
+        </w:rPr>
+        <w:t>Strong multicollinearity</w:t>
+      </w:r>
+      <w:r>
+        <w:t xml:space="preserve"> detected: `radius_mean` ↔ `perimeter_mean` (r &gt; 0.98) and `radius_mean` ↔ `area_mean` (r &gt; 0.98).</w:t>
       </w:r>
     </w:p>
     <w:p>
       <w:pPr>
         <w:pStyle w:val="ListBullet"/>
+        <w:spacing w:after="60"/>
       </w:pPr>
       <w:r>
-        <w:t>concave points_mean and concavity_mean show the strongest class separation.</w:t>
+        <w:t>`concave points_mean` and `concavity_mean` show the strongest individual separation between classes.</w:t>
       </w:r>
     </w:p>
     <w:p>
       <w:pPr>
-        <w:pStyle w:val="Heading1"/>
+        <w:spacing w:before="280" w:after="120"/>
       </w:pPr>
       <w:r>
+        <w:rPr>
+          <w:b/>
+          <w:color w:val="2B6CB0"/>
+          <w:sz w:val="30"/>
+        </w:rPr>
         <w:t>4. Variables</w:t>
       </w:r>
     </w:p>
     <w:p>
       <w:pPr>
-        <w:pStyle w:val="Heading2"/>
+        <w:spacing w:before="200" w:after="80"/>
       </w:pPr>
       <w:r>
-        <w:t>4.1 Independent Variables (30 features)</w:t>
+        <w:rPr>
+          <w:b/>
+          <w:color w:val="2D3748"/>
+          <w:sz w:val="24"/>
+        </w:rPr>
+        <w:t>4.1 Independent Variables (30 features — grouped)</w:t>
       </w:r>
     </w:p>
     <w:tbl>
       <w:tblPr>
-        <w:tblStyle w:val="TableGrid"/>
         <w:tblW w:type="auto" w:w="0"/>
+        <w:jc w:val="center"/>
         <w:tblLook w:firstColumn="1" w:firstRow="1" w:lastColumn="0" w:lastRow="0" w:noHBand="0" w:noVBand="1" w:val="04A0"/>
       </w:tblPr>
       <w:tblGrid>
-        <w:gridCol w:w="4533"/>
-        <w:gridCol w:w="4533"/>
+        <w:gridCol w:w="4680"/>
+        <w:gridCol w:w="4680"/>
       </w:tblGrid>
       <w:tr>
         <w:tc>
           <w:tcPr>
-            <w:tcW w:type="dxa" w:w="4533"/>
-            <w:shd w:val="clear" w:color="auto" w:fill="1F77B4"/>
+            <w:tcW w:type="dxa" w:w="4680"/>
+            <w:shd w:val="clear" w:color="auto" w:fill="2B6CB0"/>
           </w:tcPr>
           <w:p>
+            <w:pPr>
+              <w:spacing w:before="80" w:after="80"/>
+            </w:pPr>
             <w:r>
               <w:rPr>
                 <w:b/>
                 <w:color w:val="FFFFFF"/>
+                <w:sz w:val="20"/>
               </w:rPr>
               <w:t>Group</w:t>
             </w:r>
@@ -598,14 +887,18 @@
         </w:tc>
         <w:tc>
           <w:tcPr>
-            <w:tcW w:type="dxa" w:w="4533"/>
-            <w:shd w:val="clear" w:color="auto" w:fill="1F77B4"/>
+            <w:tcW w:type="dxa" w:w="4680"/>
+            <w:shd w:val="clear" w:color="auto" w:fill="2B6CB0"/>
           </w:tcPr>
           <w:p>
+            <w:pPr>
+              <w:spacing w:before="80" w:after="80"/>
+            </w:pPr>
             <w:r>
               <w:rPr>
                 <w:b/>
                 <w:color w:val="FFFFFF"/>
+                <w:sz w:val="20"/>
               </w:rPr>
               <w:t>Features</w:t>
             </w:r>
@@ -615,22 +908,32 @@
       <w:tr>
         <w:tc>
           <w:tcPr>
-            <w:tcW w:type="dxa" w:w="4533"/>
-            <w:shd w:val="clear" w:color="auto" w:fill="E8F4FD"/>
+            <w:tcW w:type="dxa" w:w="4680"/>
           </w:tcPr>
           <w:p>
+            <w:pPr>
+              <w:spacing w:before="80" w:after="80"/>
+            </w:pPr>
             <w:r>
+              <w:rPr>
+                <w:sz w:val="19"/>
+              </w:rPr>
               <w:t>Mean (10)</w:t>
             </w:r>
           </w:p>
         </w:tc>
         <w:tc>
           <w:tcPr>
-            <w:tcW w:type="dxa" w:w="4533"/>
-            <w:shd w:val="clear" w:color="auto" w:fill="E8F4FD"/>
+            <w:tcW w:type="dxa" w:w="4680"/>
           </w:tcPr>
           <w:p>
+            <w:pPr>
+              <w:spacing w:before="80" w:after="80"/>
+            </w:pPr>
             <w:r>
+              <w:rPr>
+                <w:sz w:val="19"/>
+              </w:rPr>
               <w:t>radius_mean, texture_mean, perimeter_mean, area_mean, smoothness_mean, compactness_mean, concavity_mean, concave points_mean, symmetry_mean, fractal_dimension_mean</w:t>
             </w:r>
           </w:p>
@@ -639,21 +942,35 @@
       <w:tr>
         <w:tc>
           <w:tcPr>
-            <w:tcW w:type="dxa" w:w="4533"/>
+            <w:tcW w:type="dxa" w:w="4680"/>
+            <w:shd w:val="clear" w:color="auto" w:fill="F7FAFC"/>
           </w:tcPr>
           <w:p>
+            <w:pPr>
+              <w:spacing w:before="80" w:after="80"/>
+            </w:pPr>
             <w:r>
+              <w:rPr>
+                <w:sz w:val="19"/>
+              </w:rPr>
               <w:t>SE (10)</w:t>
             </w:r>
           </w:p>
         </w:tc>
         <w:tc>
           <w:tcPr>
-            <w:tcW w:type="dxa" w:w="4533"/>
+            <w:tcW w:type="dxa" w:w="4680"/>
+            <w:shd w:val="clear" w:color="auto" w:fill="F7FAFC"/>
           </w:tcPr>
           <w:p>
+            <w:pPr>
+              <w:spacing w:before="80" w:after="80"/>
+            </w:pPr>
             <w:r>
-              <w:t>radius_se, texture_se, perimeter_se, area_se, smoothness_se, … (10 standard error features)</w:t>
+              <w:rPr>
+                <w:sz w:val="19"/>
+              </w:rPr>
+              <w:t>radius_se, texture_se, perimeter_se, area_se, smoothness_se, …</w:t>
             </w:r>
           </w:p>
         </w:tc>
@@ -661,23 +978,33 @@
       <w:tr>
         <w:tc>
           <w:tcPr>
-            <w:tcW w:type="dxa" w:w="4533"/>
-            <w:shd w:val="clear" w:color="auto" w:fill="E8F4FD"/>
+            <w:tcW w:type="dxa" w:w="4680"/>
           </w:tcPr>
           <w:p>
+            <w:pPr>
+              <w:spacing w:before="80" w:after="80"/>
+            </w:pPr>
             <w:r>
+              <w:rPr>
+                <w:sz w:val="19"/>
+              </w:rPr>
               <w:t>Worst (10)</w:t>
             </w:r>
           </w:p>
         </w:tc>
         <w:tc>
           <w:tcPr>
-            <w:tcW w:type="dxa" w:w="4533"/>
-            <w:shd w:val="clear" w:color="auto" w:fill="E8F4FD"/>
+            <w:tcW w:type="dxa" w:w="4680"/>
           </w:tcPr>
           <w:p>
+            <w:pPr>
+              <w:spacing w:before="80" w:after="80"/>
+            </w:pPr>
             <w:r>
-              <w:t>radius_worst, texture_worst, perimeter_worst, area_worst, smoothness_worst, … (10 worst features)</w:t>
+              <w:rPr>
+                <w:sz w:val="19"/>
+              </w:rPr>
+              <w:t>radius_worst, texture_worst, perimeter_worst, area_worst, smoothness_worst, …</w:t>
             </w:r>
           </w:p>
         </w:tc>
@@ -686,34 +1013,43 @@
     <w:p/>
     <w:p>
       <w:pPr>
-        <w:pStyle w:val="Heading2"/>
+        <w:spacing w:before="200" w:after="80"/>
       </w:pPr>
       <w:r>
-        <w:t>4.2 Dependent Variable</w:t>
+        <w:rPr>
+          <w:b/>
+          <w:color w:val="2D3748"/>
+          <w:sz w:val="24"/>
+        </w:rPr>
+        <w:t>4.2 Dependent Variable (Target)</w:t>
       </w:r>
     </w:p>
     <w:tbl>
       <w:tblPr>
-        <w:tblStyle w:val="TableGrid"/>
         <w:tblW w:type="auto" w:w="0"/>
+        <w:jc w:val="center"/>
         <w:tblLook w:firstColumn="1" w:firstRow="1" w:lastColumn="0" w:lastRow="0" w:noHBand="0" w:noVBand="1" w:val="04A0"/>
       </w:tblPr>
       <w:tblGrid>
-        <w:gridCol w:w="3022"/>
-        <w:gridCol w:w="3022"/>
-        <w:gridCol w:w="3022"/>
+        <w:gridCol w:w="3120"/>
+        <w:gridCol w:w="3120"/>
+        <w:gridCol w:w="3120"/>
       </w:tblGrid>
       <w:tr>
         <w:tc>
           <w:tcPr>
-            <w:tcW w:type="dxa" w:w="3022"/>
-            <w:shd w:val="clear" w:color="auto" w:fill="1F77B4"/>
+            <w:tcW w:type="dxa" w:w="3120"/>
+            <w:shd w:val="clear" w:color="auto" w:fill="2B6CB0"/>
           </w:tcPr>
           <w:p>
+            <w:pPr>
+              <w:spacing w:before="80" w:after="80"/>
+            </w:pPr>
             <w:r>
               <w:rPr>
                 <w:b/>
                 <w:color w:val="FFFFFF"/>
+                <w:sz w:val="20"/>
               </w:rPr>
               <w:t>Variable</w:t>
             </w:r>
@@ -721,14 +1057,18 @@
         </w:tc>
         <w:tc>
           <w:tcPr>
-            <w:tcW w:type="dxa" w:w="3022"/>
-            <w:shd w:val="clear" w:color="auto" w:fill="1F77B4"/>
+            <w:tcW w:type="dxa" w:w="3120"/>
+            <w:shd w:val="clear" w:color="auto" w:fill="2B6CB0"/>
           </w:tcPr>
           <w:p>
+            <w:pPr>
+              <w:spacing w:before="80" w:after="80"/>
+            </w:pPr>
             <w:r>
               <w:rPr>
                 <w:b/>
                 <w:color w:val="FFFFFF"/>
+                <w:sz w:val="20"/>
               </w:rPr>
               <w:t>Type</w:t>
             </w:r>
@@ -736,14 +1076,18 @@
         </w:tc>
         <w:tc>
           <w:tcPr>
-            <w:tcW w:type="dxa" w:w="3022"/>
-            <w:shd w:val="clear" w:color="auto" w:fill="1F77B4"/>
+            <w:tcW w:type="dxa" w:w="3120"/>
+            <w:shd w:val="clear" w:color="auto" w:fill="2B6CB0"/>
           </w:tcPr>
           <w:p>
+            <w:pPr>
+              <w:spacing w:before="80" w:after="80"/>
+            </w:pPr>
             <w:r>
               <w:rPr>
                 <w:b/>
                 <w:color w:val="FFFFFF"/>
+                <w:sz w:val="20"/>
               </w:rPr>
               <w:t>Encoding</w:t>
             </w:r>
@@ -753,34 +1097,49 @@
       <w:tr>
         <w:tc>
           <w:tcPr>
-            <w:tcW w:type="dxa" w:w="3022"/>
-            <w:shd w:val="clear" w:color="auto" w:fill="E8F4FD"/>
+            <w:tcW w:type="dxa" w:w="3120"/>
           </w:tcPr>
           <w:p>
+            <w:pPr>
+              <w:spacing w:before="80" w:after="80"/>
+            </w:pPr>
             <w:r>
+              <w:rPr>
+                <w:sz w:val="19"/>
+              </w:rPr>
               <w:t>diagnosis</w:t>
             </w:r>
           </w:p>
         </w:tc>
         <w:tc>
           <w:tcPr>
-            <w:tcW w:type="dxa" w:w="3022"/>
-            <w:shd w:val="clear" w:color="auto" w:fill="E8F4FD"/>
+            <w:tcW w:type="dxa" w:w="3120"/>
           </w:tcPr>
           <w:p>
+            <w:pPr>
+              <w:spacing w:before="80" w:after="80"/>
+            </w:pPr>
             <w:r>
+              <w:rPr>
+                <w:sz w:val="19"/>
+              </w:rPr>
               <w:t>Binary Categorical</w:t>
             </w:r>
           </w:p>
         </w:tc>
         <w:tc>
           <w:tcPr>
-            <w:tcW w:type="dxa" w:w="3022"/>
-            <w:shd w:val="clear" w:color="auto" w:fill="E8F4FD"/>
+            <w:tcW w:type="dxa" w:w="3120"/>
           </w:tcPr>
           <w:p>
+            <w:pPr>
+              <w:spacing w:before="80" w:after="80"/>
+            </w:pPr>
             <w:r>
-              <w:t>Malignant (M) → 1,  Benign (B) → 0</w:t>
+              <w:rPr>
+                <w:sz w:val="19"/>
+              </w:rPr>
+              <w:t>Malignant (M) → 1, Benign (B) → 0</w:t>
             </w:r>
           </w:p>
         </w:tc>
@@ -789,41 +1148,74 @@
     <w:p/>
     <w:p>
       <w:pPr>
-        <w:pStyle w:val="Heading1"/>
+        <w:spacing w:before="280" w:after="120"/>
       </w:pPr>
       <w:r>
+        <w:rPr>
+          <w:b/>
+          <w:color w:val="2B6CB0"/>
+          <w:sz w:val="30"/>
+        </w:rPr>
         <w:t>5. Feature Selection</w:t>
       </w:r>
     </w:p>
     <w:p>
+      <w:pPr>
+        <w:spacing w:after="120"/>
+      </w:pPr>
       <w:r>
-        <w:t>Highly correlated features (r &gt; 0.95) were removed to reduce multicollinearity. StandardScaler was applied to normalize all features (mean=0, std=1).</w:t>
-        <w:br/>
-        <w:t>Dropped: perimeter_mean and area_mean — redundant with radius_mean (r &gt; 0.98).</w:t>
+        <w:t xml:space="preserve">Highly correlated features (r &gt; 0.95) were removed to reduce multicollinearity. </w:t>
+      </w:r>
+      <w:r>
+        <w:rPr>
+          <w:rFonts w:ascii="Consolas" w:hAnsi="Consolas"/>
+          <w:sz w:val="19"/>
+        </w:rPr>
+        <w:t>StandardScaler</w:t>
+      </w:r>
+      <w:r>
+        <w:t xml:space="preserve"> was applied to normalize all features (mean = 0, std = 1).</w:t>
+      </w:r>
+    </w:p>
+    <w:p>
+      <w:pPr>
+        <w:spacing w:before="200" w:after="80"/>
+      </w:pPr>
+      <w:r>
+        <w:rPr>
+          <w:b/>
+          <w:color w:val="2D3748"/>
+          <w:sz w:val="24"/>
+        </w:rPr>
+        <w:t>Selected Features for Logistic Regression</w:t>
       </w:r>
     </w:p>
     <w:tbl>
       <w:tblPr>
-        <w:tblStyle w:val="TableGrid"/>
         <w:tblW w:type="auto" w:w="0"/>
+        <w:jc w:val="center"/>
         <w:tblLook w:firstColumn="1" w:firstRow="1" w:lastColumn="0" w:lastRow="0" w:noHBand="0" w:noVBand="1" w:val="04A0"/>
       </w:tblPr>
       <w:tblGrid>
-        <w:gridCol w:w="3022"/>
-        <w:gridCol w:w="3022"/>
-        <w:gridCol w:w="3022"/>
+        <w:gridCol w:w="3120"/>
+        <w:gridCol w:w="3120"/>
+        <w:gridCol w:w="3120"/>
       </w:tblGrid>
       <w:tr>
         <w:tc>
           <w:tcPr>
-            <w:tcW w:type="dxa" w:w="3022"/>
-            <w:shd w:val="clear" w:color="auto" w:fill="1F77B4"/>
+            <w:tcW w:type="dxa" w:w="3120"/>
+            <w:shd w:val="clear" w:color="auto" w:fill="2B6CB0"/>
           </w:tcPr>
           <w:p>
+            <w:pPr>
+              <w:spacing w:before="80" w:after="80"/>
+            </w:pPr>
             <w:r>
               <w:rPr>
                 <w:b/>
                 <w:color w:val="FFFFFF"/>
+                <w:sz w:val="20"/>
               </w:rPr>
               <w:t>#</w:t>
             </w:r>
@@ -831,14 +1223,18 @@
         </w:tc>
         <w:tc>
           <w:tcPr>
-            <w:tcW w:type="dxa" w:w="3022"/>
-            <w:shd w:val="clear" w:color="auto" w:fill="1F77B4"/>
+            <w:tcW w:type="dxa" w:w="3120"/>
+            <w:shd w:val="clear" w:color="auto" w:fill="2B6CB0"/>
           </w:tcPr>
           <w:p>
+            <w:pPr>
+              <w:spacing w:before="80" w:after="80"/>
+            </w:pPr>
             <w:r>
               <w:rPr>
                 <w:b/>
                 <w:color w:val="FFFFFF"/>
+                <w:sz w:val="20"/>
               </w:rPr>
               <w:t>Feature</w:t>
             </w:r>
@@ -846,14 +1242,18 @@
         </w:tc>
         <w:tc>
           <w:tcPr>
-            <w:tcW w:type="dxa" w:w="3022"/>
-            <w:shd w:val="clear" w:color="auto" w:fill="1F77B4"/>
+            <w:tcW w:type="dxa" w:w="3120"/>
+            <w:shd w:val="clear" w:color="auto" w:fill="2B6CB0"/>
           </w:tcPr>
           <w:p>
+            <w:pPr>
+              <w:spacing w:before="80" w:after="80"/>
+            </w:pPr>
             <w:r>
               <w:rPr>
                 <w:b/>
                 <w:color w:val="FFFFFF"/>
+                <w:sz w:val="20"/>
               </w:rPr>
               <w:t>Reason</w:t>
             </w:r>
@@ -863,33 +1263,48 @@
       <w:tr>
         <w:tc>
           <w:tcPr>
-            <w:tcW w:type="dxa" w:w="3022"/>
-            <w:shd w:val="clear" w:color="auto" w:fill="E8F4FD"/>
+            <w:tcW w:type="dxa" w:w="3120"/>
           </w:tcPr>
           <w:p>
+            <w:pPr>
+              <w:spacing w:before="80" w:after="80"/>
+            </w:pPr>
             <w:r>
+              <w:rPr>
+                <w:sz w:val="19"/>
+              </w:rPr>
               <w:t>1</w:t>
             </w:r>
           </w:p>
         </w:tc>
         <w:tc>
           <w:tcPr>
-            <w:tcW w:type="dxa" w:w="3022"/>
-            <w:shd w:val="clear" w:color="auto" w:fill="E8F4FD"/>
+            <w:tcW w:type="dxa" w:w="3120"/>
           </w:tcPr>
           <w:p>
+            <w:pPr>
+              <w:spacing w:before="80" w:after="80"/>
+            </w:pPr>
             <w:r>
+              <w:rPr>
+                <w:sz w:val="19"/>
+              </w:rPr>
               <w:t>radius_mean</w:t>
             </w:r>
           </w:p>
         </w:tc>
         <w:tc>
           <w:tcPr>
-            <w:tcW w:type="dxa" w:w="3022"/>
-            <w:shd w:val="clear" w:color="auto" w:fill="E8F4FD"/>
+            <w:tcW w:type="dxa" w:w="3120"/>
           </w:tcPr>
           <w:p>
+            <w:pPr>
+              <w:spacing w:before="80" w:after="80"/>
+            </w:pPr>
             <w:r>
+              <w:rPr>
+                <w:sz w:val="19"/>
+              </w:rPr>
               <w:t>Strong M/B discriminator</w:t>
             </w:r>
           </w:p>
@@ -898,30 +1313,51 @@
       <w:tr>
         <w:tc>
           <w:tcPr>
-            <w:tcW w:type="dxa" w:w="3022"/>
+            <w:tcW w:type="dxa" w:w="3120"/>
+            <w:shd w:val="clear" w:color="auto" w:fill="F7FAFC"/>
           </w:tcPr>
           <w:p>
+            <w:pPr>
+              <w:spacing w:before="80" w:after="80"/>
+            </w:pPr>
             <w:r>
+              <w:rPr>
+                <w:sz w:val="19"/>
+              </w:rPr>
               <w:t>2</w:t>
             </w:r>
           </w:p>
         </w:tc>
         <w:tc>
           <w:tcPr>
-            <w:tcW w:type="dxa" w:w="3022"/>
+            <w:tcW w:type="dxa" w:w="3120"/>
+            <w:shd w:val="clear" w:color="auto" w:fill="F7FAFC"/>
           </w:tcPr>
           <w:p>
+            <w:pPr>
+              <w:spacing w:before="80" w:after="80"/>
+            </w:pPr>
             <w:r>
+              <w:rPr>
+                <w:sz w:val="19"/>
+              </w:rPr>
               <w:t>texture_mean</w:t>
             </w:r>
           </w:p>
         </w:tc>
         <w:tc>
           <w:tcPr>
-            <w:tcW w:type="dxa" w:w="3022"/>
+            <w:tcW w:type="dxa" w:w="3120"/>
+            <w:shd w:val="clear" w:color="auto" w:fill="F7FAFC"/>
           </w:tcPr>
           <w:p>
+            <w:pPr>
+              <w:spacing w:before="80" w:after="80"/>
+            </w:pPr>
             <w:r>
+              <w:rPr>
+                <w:sz w:val="19"/>
+              </w:rPr>
               <w:t>Independent of geometric features</w:t>
             </w:r>
           </w:p>
@@ -930,33 +1366,48 @@
       <w:tr>
         <w:tc>
           <w:tcPr>
-            <w:tcW w:type="dxa" w:w="3022"/>
-            <w:shd w:val="clear" w:color="auto" w:fill="E8F4FD"/>
+            <w:tcW w:type="dxa" w:w="3120"/>
           </w:tcPr>
           <w:p>
+            <w:pPr>
+              <w:spacing w:before="80" w:after="80"/>
+            </w:pPr>
             <w:r>
+              <w:rPr>
+                <w:sz w:val="19"/>
+              </w:rPr>
               <w:t>3</w:t>
             </w:r>
           </w:p>
         </w:tc>
         <w:tc>
           <w:tcPr>
-            <w:tcW w:type="dxa" w:w="3022"/>
-            <w:shd w:val="clear" w:color="auto" w:fill="E8F4FD"/>
+            <w:tcW w:type="dxa" w:w="3120"/>
           </w:tcPr>
           <w:p>
+            <w:pPr>
+              <w:spacing w:before="80" w:after="80"/>
+            </w:pPr>
             <w:r>
+              <w:rPr>
+                <w:sz w:val="19"/>
+              </w:rPr>
               <w:t>smoothness_mean</w:t>
             </w:r>
           </w:p>
         </w:tc>
         <w:tc>
           <w:tcPr>
-            <w:tcW w:type="dxa" w:w="3022"/>
-            <w:shd w:val="clear" w:color="auto" w:fill="E8F4FD"/>
+            <w:tcW w:type="dxa" w:w="3120"/>
           </w:tcPr>
           <w:p>
+            <w:pPr>
+              <w:spacing w:before="80" w:after="80"/>
+            </w:pPr>
             <w:r>
+              <w:rPr>
+                <w:sz w:val="19"/>
+              </w:rPr>
               <w:t>Surface irregularity indicator</w:t>
             </w:r>
           </w:p>
@@ -965,30 +1416,51 @@
       <w:tr>
         <w:tc>
           <w:tcPr>
-            <w:tcW w:type="dxa" w:w="3022"/>
+            <w:tcW w:type="dxa" w:w="3120"/>
+            <w:shd w:val="clear" w:color="auto" w:fill="F7FAFC"/>
           </w:tcPr>
           <w:p>
+            <w:pPr>
+              <w:spacing w:before="80" w:after="80"/>
+            </w:pPr>
             <w:r>
+              <w:rPr>
+                <w:sz w:val="19"/>
+              </w:rPr>
               <w:t>4</w:t>
             </w:r>
           </w:p>
         </w:tc>
         <w:tc>
           <w:tcPr>
-            <w:tcW w:type="dxa" w:w="3022"/>
+            <w:tcW w:type="dxa" w:w="3120"/>
+            <w:shd w:val="clear" w:color="auto" w:fill="F7FAFC"/>
           </w:tcPr>
           <w:p>
+            <w:pPr>
+              <w:spacing w:before="80" w:after="80"/>
+            </w:pPr>
             <w:r>
+              <w:rPr>
+                <w:sz w:val="19"/>
+              </w:rPr>
               <w:t>compactness_mean</w:t>
             </w:r>
           </w:p>
         </w:tc>
         <w:tc>
           <w:tcPr>
-            <w:tcW w:type="dxa" w:w="3022"/>
+            <w:tcW w:type="dxa" w:w="3120"/>
+            <w:shd w:val="clear" w:color="auto" w:fill="F7FAFC"/>
           </w:tcPr>
           <w:p>
+            <w:pPr>
+              <w:spacing w:before="80" w:after="80"/>
+            </w:pPr>
             <w:r>
+              <w:rPr>
+                <w:sz w:val="19"/>
+              </w:rPr>
               <w:t>Shape complexity</w:t>
             </w:r>
           </w:p>
@@ -997,33 +1469,48 @@
       <w:tr>
         <w:tc>
           <w:tcPr>
-            <w:tcW w:type="dxa" w:w="3022"/>
-            <w:shd w:val="clear" w:color="auto" w:fill="E8F4FD"/>
+            <w:tcW w:type="dxa" w:w="3120"/>
           </w:tcPr>
           <w:p>
+            <w:pPr>
+              <w:spacing w:before="80" w:after="80"/>
+            </w:pPr>
             <w:r>
+              <w:rPr>
+                <w:sz w:val="19"/>
+              </w:rPr>
               <w:t>5</w:t>
             </w:r>
           </w:p>
         </w:tc>
         <w:tc>
           <w:tcPr>
-            <w:tcW w:type="dxa" w:w="3022"/>
-            <w:shd w:val="clear" w:color="auto" w:fill="E8F4FD"/>
+            <w:tcW w:type="dxa" w:w="3120"/>
           </w:tcPr>
           <w:p>
+            <w:pPr>
+              <w:spacing w:before="80" w:after="80"/>
+            </w:pPr>
             <w:r>
+              <w:rPr>
+                <w:sz w:val="19"/>
+              </w:rPr>
               <w:t>concavity_mean</w:t>
             </w:r>
           </w:p>
         </w:tc>
         <w:tc>
           <w:tcPr>
-            <w:tcW w:type="dxa" w:w="3022"/>
-            <w:shd w:val="clear" w:color="auto" w:fill="E8F4FD"/>
+            <w:tcW w:type="dxa" w:w="3120"/>
           </w:tcPr>
           <w:p>
+            <w:pPr>
+              <w:spacing w:before="80" w:after="80"/>
+            </w:pPr>
             <w:r>
+              <w:rPr>
+                <w:sz w:val="19"/>
+              </w:rPr>
               <w:t>Higher in malignant tumors</w:t>
             </w:r>
           </w:p>
@@ -1032,30 +1519,51 @@
       <w:tr>
         <w:tc>
           <w:tcPr>
-            <w:tcW w:type="dxa" w:w="3022"/>
+            <w:tcW w:type="dxa" w:w="3120"/>
+            <w:shd w:val="clear" w:color="auto" w:fill="F7FAFC"/>
           </w:tcPr>
           <w:p>
+            <w:pPr>
+              <w:spacing w:before="80" w:after="80"/>
+            </w:pPr>
             <w:r>
+              <w:rPr>
+                <w:sz w:val="19"/>
+              </w:rPr>
               <w:t>6</w:t>
             </w:r>
           </w:p>
         </w:tc>
         <w:tc>
           <w:tcPr>
-            <w:tcW w:type="dxa" w:w="3022"/>
+            <w:tcW w:type="dxa" w:w="3120"/>
+            <w:shd w:val="clear" w:color="auto" w:fill="F7FAFC"/>
           </w:tcPr>
           <w:p>
+            <w:pPr>
+              <w:spacing w:before="80" w:after="80"/>
+            </w:pPr>
             <w:r>
+              <w:rPr>
+                <w:sz w:val="19"/>
+              </w:rPr>
               <w:t>concave points_mean</w:t>
             </w:r>
           </w:p>
         </w:tc>
         <w:tc>
           <w:tcPr>
-            <w:tcW w:type="dxa" w:w="3022"/>
+            <w:tcW w:type="dxa" w:w="3120"/>
+            <w:shd w:val="clear" w:color="auto" w:fill="F7FAFC"/>
           </w:tcPr>
           <w:p>
+            <w:pPr>
+              <w:spacing w:before="80" w:after="80"/>
+            </w:pPr>
             <w:r>
+              <w:rPr>
+                <w:sz w:val="19"/>
+              </w:rPr>
               <w:t>Highest predictive power</w:t>
             </w:r>
           </w:p>
@@ -1064,33 +1572,48 @@
       <w:tr>
         <w:tc>
           <w:tcPr>
-            <w:tcW w:type="dxa" w:w="3022"/>
-            <w:shd w:val="clear" w:color="auto" w:fill="E8F4FD"/>
+            <w:tcW w:type="dxa" w:w="3120"/>
           </w:tcPr>
           <w:p>
+            <w:pPr>
+              <w:spacing w:before="80" w:after="80"/>
+            </w:pPr>
             <w:r>
+              <w:rPr>
+                <w:sz w:val="19"/>
+              </w:rPr>
               <w:t>7</w:t>
             </w:r>
           </w:p>
         </w:tc>
         <w:tc>
           <w:tcPr>
-            <w:tcW w:type="dxa" w:w="3022"/>
-            <w:shd w:val="clear" w:color="auto" w:fill="E8F4FD"/>
+            <w:tcW w:type="dxa" w:w="3120"/>
           </w:tcPr>
           <w:p>
+            <w:pPr>
+              <w:spacing w:before="80" w:after="80"/>
+            </w:pPr>
             <w:r>
+              <w:rPr>
+                <w:sz w:val="19"/>
+              </w:rPr>
               <w:t>symmetry_mean</w:t>
             </w:r>
           </w:p>
         </w:tc>
         <w:tc>
           <w:tcPr>
-            <w:tcW w:type="dxa" w:w="3022"/>
-            <w:shd w:val="clear" w:color="auto" w:fill="E8F4FD"/>
+            <w:tcW w:type="dxa" w:w="3120"/>
           </w:tcPr>
           <w:p>
+            <w:pPr>
+              <w:spacing w:before="80" w:after="80"/>
+            </w:pPr>
             <w:r>
+              <w:rPr>
+                <w:sz w:val="19"/>
+              </w:rPr>
               <w:t>Structural asymmetry</w:t>
             </w:r>
           </w:p>
@@ -1100,23 +1623,79 @@
     <w:p/>
     <w:p>
       <w:pPr>
-        <w:pStyle w:val="Heading1"/>
+        <w:spacing w:after="120"/>
+      </w:pPr>
+      <w:r/>
+      <w:r>
+        <w:rPr>
+          <w:b/>
+        </w:rPr>
+        <w:t>Dropped:</w:t>
+      </w:r>
+      <w:r>
+        <w:t xml:space="preserve"> </w:t>
+      </w:r>
+      <w:r>
+        <w:rPr>
+          <w:rFonts w:ascii="Consolas" w:hAnsi="Consolas"/>
+          <w:sz w:val="19"/>
+        </w:rPr>
+        <w:t>perimeter_mean</w:t>
+      </w:r>
+      <w:r>
+        <w:t xml:space="preserve">, </w:t>
+      </w:r>
+      <w:r>
+        <w:rPr>
+          <w:rFonts w:ascii="Consolas" w:hAnsi="Consolas"/>
+          <w:sz w:val="19"/>
+        </w:rPr>
+        <w:t>area_mean</w:t>
+      </w:r>
+      <w:r>
+        <w:t xml:space="preserve"> — redundant with </w:t>
+      </w:r>
+      <w:r>
+        <w:rPr>
+          <w:rFonts w:ascii="Consolas" w:hAnsi="Consolas"/>
+          <w:sz w:val="19"/>
+        </w:rPr>
+        <w:t>radius_mean</w:t>
+      </w:r>
+      <w:r>
+        <w:t xml:space="preserve"> (r &gt; 0.98).</w:t>
+      </w:r>
+    </w:p>
+    <w:p>
+      <w:pPr>
+        <w:spacing w:before="280" w:after="120"/>
       </w:pPr>
       <w:r>
+        <w:rPr>
+          <w:b/>
+          <w:color w:val="2B6CB0"/>
+          <w:sz w:val="30"/>
+        </w:rPr>
         <w:t>6. Prediction Model — Logistic Regression</w:t>
       </w:r>
     </w:p>
     <w:p>
       <w:pPr>
-        <w:pStyle w:val="Heading2"/>
+        <w:spacing w:before="200" w:after="80"/>
       </w:pPr>
       <w:r>
+        <w:rPr>
+          <w:b/>
+          <w:color w:val="2D3748"/>
+          <w:sz w:val="24"/>
+        </w:rPr>
         <w:t>6.1 Why Logistic Regression?</w:t>
       </w:r>
     </w:p>
     <w:p>
       <w:pPr>
         <w:pStyle w:val="ListBullet"/>
+        <w:spacing w:after="60"/>
       </w:pPr>
       <w:r>
         <w:t>Designed for binary classification (M vs B)</w:t>
@@ -1125,6 +1704,7 @@
     <w:p>
       <w:pPr>
         <w:pStyle w:val="ListBullet"/>
+        <w:spacing w:after="60"/>
       </w:pPr>
       <w:r>
         <w:t>Outputs interpretable probability via sigmoid function</w:t>
@@ -1133,6 +1713,7 @@
     <w:p>
       <w:pPr>
         <w:pStyle w:val="ListBullet"/>
+        <w:spacing w:after="60"/>
       </w:pPr>
       <w:r>
         <w:t>Fast training, regularization-ready, clinically explainable</w:t>
@@ -1140,62 +1721,89 @@
     </w:p>
     <w:p>
       <w:pPr>
-        <w:pStyle w:val="Heading2"/>
+        <w:spacing w:before="200" w:after="80"/>
       </w:pPr>
       <w:r>
+        <w:rPr>
+          <w:b/>
+          <w:color w:val="2D3748"/>
+          <w:sz w:val="24"/>
+        </w:rPr>
         <w:t>6.2 Sigmoid Function</w:t>
       </w:r>
     </w:p>
     <w:p>
       <w:pPr>
-        <w:ind w:left="567"/>
-        <w:shd w:val="clear" w:color="auto" w:fill="F2F2F2"/>
+        <w:spacing w:before="120" w:after="120"/>
+        <w:ind w:left="288"/>
       </w:pPr>
       <w:r>
         <w:rPr>
-          <w:rFonts w:ascii="Courier New" w:hAnsi="Courier New"/>
-          <w:sz w:val="18"/>
+          <w:rFonts w:ascii="Consolas" w:hAnsi="Consolas"/>
+          <w:color w:val="1A202C"/>
+          <w:sz w:val="19"/>
         </w:rPr>
         <w:t>P(Y=1|X) = 1 / (1 + e^(−z))</w:t>
         <w:br/>
         <w:t>where z = β₀ + β₁x₁ + β₂x₂ + ... + β₇x₇</w:t>
         <w:br/>
-        <w:br/>
-        <w:t>If P ≥ 0.5 → Malignant</w:t>
-        <w:br/>
-        <w:t>If P &lt; 0.5  → Benign</w:t>
       </w:r>
     </w:p>
     <w:p>
       <w:pPr>
-        <w:pStyle w:val="Heading2"/>
+        <w:spacing w:after="120"/>
       </w:pPr>
       <w:r>
+        <w:t>If P(Y=1|X) ≥ 0.5 → Predicted: Malignant</w:t>
+      </w:r>
+    </w:p>
+    <w:p>
+      <w:pPr>
+        <w:spacing w:after="120"/>
+      </w:pPr>
+      <w:r>
+        <w:t>If P(Y=1|X) &lt; 0.5 → Predicted: Benign</w:t>
+      </w:r>
+    </w:p>
+    <w:p>
+      <w:pPr>
+        <w:spacing w:before="200" w:after="80"/>
+      </w:pPr>
+      <w:r>
+        <w:rPr>
+          <w:b/>
+          <w:color w:val="2D3748"/>
+          <w:sz w:val="24"/>
+        </w:rPr>
         <w:t>6.3 Train / Test Split</w:t>
       </w:r>
     </w:p>
     <w:tbl>
       <w:tblPr>
-        <w:tblStyle w:val="TableGrid"/>
         <w:tblW w:type="auto" w:w="0"/>
+        <w:jc w:val="center"/>
         <w:tblLook w:firstColumn="1" w:firstRow="1" w:lastColumn="0" w:lastRow="0" w:noHBand="0" w:noVBand="1" w:val="04A0"/>
       </w:tblPr>
       <w:tblGrid>
-        <w:gridCol w:w="3022"/>
-        <w:gridCol w:w="3022"/>
-        <w:gridCol w:w="3022"/>
+        <w:gridCol w:w="3120"/>
+        <w:gridCol w:w="3120"/>
+        <w:gridCol w:w="3120"/>
       </w:tblGrid>
       <w:tr>
         <w:tc>
           <w:tcPr>
-            <w:tcW w:type="dxa" w:w="3022"/>
-            <w:shd w:val="clear" w:color="auto" w:fill="1F77B4"/>
+            <w:tcW w:type="dxa" w:w="3120"/>
+            <w:shd w:val="clear" w:color="auto" w:fill="2B6CB0"/>
           </w:tcPr>
           <w:p>
+            <w:pPr>
+              <w:spacing w:before="80" w:after="80"/>
+            </w:pPr>
             <w:r>
               <w:rPr>
                 <w:b/>
                 <w:color w:val="FFFFFF"/>
+                <w:sz w:val="20"/>
               </w:rPr>
               <w:t>Split</w:t>
             </w:r>
@@ -1203,14 +1811,18 @@
         </w:tc>
         <w:tc>
           <w:tcPr>
-            <w:tcW w:type="dxa" w:w="3022"/>
-            <w:shd w:val="clear" w:color="auto" w:fill="1F77B4"/>
+            <w:tcW w:type="dxa" w:w="3120"/>
+            <w:shd w:val="clear" w:color="auto" w:fill="2B6CB0"/>
           </w:tcPr>
           <w:p>
+            <w:pPr>
+              <w:spacing w:before="80" w:after="80"/>
+            </w:pPr>
             <w:r>
               <w:rPr>
                 <w:b/>
                 <w:color w:val="FFFFFF"/>
+                <w:sz w:val="20"/>
               </w:rPr>
               <w:t>Records</w:t>
             </w:r>
@@ -1218,14 +1830,18 @@
         </w:tc>
         <w:tc>
           <w:tcPr>
-            <w:tcW w:type="dxa" w:w="3022"/>
-            <w:shd w:val="clear" w:color="auto" w:fill="1F77B4"/>
+            <w:tcW w:type="dxa" w:w="3120"/>
+            <w:shd w:val="clear" w:color="auto" w:fill="2B6CB0"/>
           </w:tcPr>
           <w:p>
+            <w:pPr>
+              <w:spacing w:before="80" w:after="80"/>
+            </w:pPr>
             <w:r>
               <w:rPr>
                 <w:b/>
                 <w:color w:val="FFFFFF"/>
+                <w:sz w:val="20"/>
               </w:rPr>
               <w:t>Proportion</w:t>
             </w:r>
@@ -1235,33 +1851,48 @@
       <w:tr>
         <w:tc>
           <w:tcPr>
-            <w:tcW w:type="dxa" w:w="3022"/>
-            <w:shd w:val="clear" w:color="auto" w:fill="E8F4FD"/>
+            <w:tcW w:type="dxa" w:w="3120"/>
           </w:tcPr>
           <w:p>
+            <w:pPr>
+              <w:spacing w:before="80" w:after="80"/>
+            </w:pPr>
             <w:r>
-              <w:t>Training</w:t>
+              <w:rPr>
+                <w:sz w:val="19"/>
+              </w:rPr>
+              <w:t>Training Set</w:t>
             </w:r>
           </w:p>
         </w:tc>
         <w:tc>
           <w:tcPr>
-            <w:tcW w:type="dxa" w:w="3022"/>
-            <w:shd w:val="clear" w:color="auto" w:fill="E8F4FD"/>
+            <w:tcW w:type="dxa" w:w="3120"/>
           </w:tcPr>
           <w:p>
+            <w:pPr>
+              <w:spacing w:before="80" w:after="80"/>
+            </w:pPr>
             <w:r>
+              <w:rPr>
+                <w:sz w:val="19"/>
+              </w:rPr>
               <w:t>910</w:t>
             </w:r>
           </w:p>
         </w:tc>
         <w:tc>
           <w:tcPr>
-            <w:tcW w:type="dxa" w:w="3022"/>
-            <w:shd w:val="clear" w:color="auto" w:fill="E8F4FD"/>
+            <w:tcW w:type="dxa" w:w="3120"/>
           </w:tcPr>
           <w:p>
+            <w:pPr>
+              <w:spacing w:before="80" w:after="80"/>
+            </w:pPr>
             <w:r>
+              <w:rPr>
+                <w:sz w:val="19"/>
+              </w:rPr>
               <w:t>80%</w:t>
             </w:r>
           </w:p>
@@ -1270,30 +1901,51 @@
       <w:tr>
         <w:tc>
           <w:tcPr>
-            <w:tcW w:type="dxa" w:w="3022"/>
+            <w:tcW w:type="dxa" w:w="3120"/>
+            <w:shd w:val="clear" w:color="auto" w:fill="F7FAFC"/>
           </w:tcPr>
           <w:p>
+            <w:pPr>
+              <w:spacing w:before="80" w:after="80"/>
+            </w:pPr>
             <w:r>
-              <w:t>Testing</w:t>
+              <w:rPr>
+                <w:sz w:val="19"/>
+              </w:rPr>
+              <w:t>Test Set</w:t>
             </w:r>
           </w:p>
         </w:tc>
         <w:tc>
           <w:tcPr>
-            <w:tcW w:type="dxa" w:w="3022"/>
+            <w:tcW w:type="dxa" w:w="3120"/>
+            <w:shd w:val="clear" w:color="auto" w:fill="F7FAFC"/>
           </w:tcPr>
           <w:p>
+            <w:pPr>
+              <w:spacing w:before="80" w:after="80"/>
+            </w:pPr>
             <w:r>
+              <w:rPr>
+                <w:sz w:val="19"/>
+              </w:rPr>
               <w:t>228</w:t>
             </w:r>
           </w:p>
         </w:tc>
         <w:tc>
           <w:tcPr>
-            <w:tcW w:type="dxa" w:w="3022"/>
+            <w:tcW w:type="dxa" w:w="3120"/>
+            <w:shd w:val="clear" w:color="auto" w:fill="F7FAFC"/>
           </w:tcPr>
           <w:p>
+            <w:pPr>
+              <w:spacing w:before="80" w:after="80"/>
+            </w:pPr>
             <w:r>
+              <w:rPr>
+                <w:sz w:val="19"/>
+              </w:rPr>
               <w:t>20%</w:t>
             </w:r>
           </w:p>
@@ -1303,27 +1955,52 @@
     <w:p/>
     <w:p>
       <w:pPr>
-        <w:pStyle w:val="Heading2"/>
+        <w:spacing w:after="120"/>
+      </w:pPr>
+      <w:r/>
+      <w:r>
+        <w:rPr>
+          <w:rFonts w:ascii="Consolas" w:hAnsi="Consolas"/>
+          <w:sz w:val="19"/>
+        </w:rPr>
+        <w:t>random_state = 42</w:t>
+      </w:r>
+      <w:r/>
+    </w:p>
+    <w:p>
+      <w:pPr>
+        <w:spacing w:before="200" w:after="80"/>
       </w:pPr>
       <w:r>
+        <w:rPr>
+          <w:b/>
+          <w:color w:val="2D3748"/>
+          <w:sz w:val="24"/>
+        </w:rPr>
         <w:t>6.4 Implementation</w:t>
       </w:r>
     </w:p>
     <w:p>
       <w:pPr>
-        <w:ind w:left="567"/>
-        <w:shd w:val="clear" w:color="auto" w:fill="F2F2F2"/>
+        <w:spacing w:before="120" w:after="120"/>
+        <w:ind w:left="288"/>
       </w:pPr>
       <w:r>
         <w:rPr>
-          <w:rFonts w:ascii="Courier New" w:hAnsi="Courier New"/>
-          <w:sz w:val="18"/>
+          <w:rFonts w:ascii="Consolas" w:hAnsi="Consolas"/>
+          <w:color w:val="1A202C"/>
+          <w:sz w:val="19"/>
         </w:rPr>
         <w:t>from sklearn.linear_model import LogisticRegression</w:t>
         <w:br/>
         <w:t>from sklearn.model_selection import train_test_split</w:t>
         <w:br/>
         <w:t>from sklearn.preprocessing import StandardScaler</w:t>
+        <w:br/>
+        <w:br/>
+        <w:t>X = df[selected_features]</w:t>
+        <w:br/>
+        <w:t>y = df['Diagnosis_Encoded']</w:t>
         <w:br/>
         <w:br/>
         <w:t>X_train, X_test, y_train, y_test = train_test_split(</w:t>
@@ -1341,45 +2018,60 @@
         <w:t>model = LogisticRegression(max_iter=1000, random_state=42)</w:t>
         <w:br/>
         <w:t>model.fit(X_train, y_train)</w:t>
+        <w:br/>
       </w:r>
     </w:p>
     <w:p>
       <w:pPr>
-        <w:pStyle w:val="Heading1"/>
+        <w:spacing w:before="280" w:after="120"/>
       </w:pPr>
       <w:r>
+        <w:rPr>
+          <w:b/>
+          <w:color w:val="2B6CB0"/>
+          <w:sz w:val="30"/>
+        </w:rPr>
         <w:t>7. Model Evaluation</w:t>
       </w:r>
     </w:p>
     <w:p>
       <w:pPr>
-        <w:pStyle w:val="Heading2"/>
+        <w:spacing w:before="200" w:after="80"/>
       </w:pPr>
       <w:r>
+        <w:rPr>
+          <w:b/>
+          <w:color w:val="2D3748"/>
+          <w:sz w:val="24"/>
+        </w:rPr>
         <w:t>7.1 Performance Metrics</w:t>
       </w:r>
     </w:p>
     <w:tbl>
       <w:tblPr>
-        <w:tblStyle w:val="TableGrid"/>
         <w:tblW w:type="auto" w:w="0"/>
+        <w:jc w:val="center"/>
         <w:tblLook w:firstColumn="1" w:firstRow="1" w:lastColumn="0" w:lastRow="0" w:noHBand="0" w:noVBand="1" w:val="04A0"/>
       </w:tblPr>
       <w:tblGrid>
-        <w:gridCol w:w="4533"/>
-        <w:gridCol w:w="4533"/>
+        <w:gridCol w:w="4680"/>
+        <w:gridCol w:w="4680"/>
       </w:tblGrid>
       <w:tr>
         <w:tc>
           <w:tcPr>
-            <w:tcW w:type="dxa" w:w="4533"/>
-            <w:shd w:val="clear" w:color="auto" w:fill="1F77B4"/>
+            <w:tcW w:type="dxa" w:w="4680"/>
+            <w:shd w:val="clear" w:color="auto" w:fill="2B6CB0"/>
           </w:tcPr>
           <w:p>
+            <w:pPr>
+              <w:spacing w:before="80" w:after="80"/>
+            </w:pPr>
             <w:r>
               <w:rPr>
                 <w:b/>
                 <w:color w:val="FFFFFF"/>
+                <w:sz w:val="20"/>
               </w:rPr>
               <w:t>Metric</w:t>
             </w:r>
@@ -1387,14 +2079,18 @@
         </w:tc>
         <w:tc>
           <w:tcPr>
-            <w:tcW w:type="dxa" w:w="4533"/>
-            <w:shd w:val="clear" w:color="auto" w:fill="1F77B4"/>
+            <w:tcW w:type="dxa" w:w="4680"/>
+            <w:shd w:val="clear" w:color="auto" w:fill="2B6CB0"/>
           </w:tcPr>
           <w:p>
+            <w:pPr>
+              <w:spacing w:before="80" w:after="80"/>
+            </w:pPr>
             <w:r>
               <w:rPr>
                 <w:b/>
                 <w:color w:val="FFFFFF"/>
+                <w:sz w:val="20"/>
               </w:rPr>
               <w:t>Value</w:t>
             </w:r>
@@ -1404,22 +2100,32 @@
       <w:tr>
         <w:tc>
           <w:tcPr>
-            <w:tcW w:type="dxa" w:w="4533"/>
-            <w:shd w:val="clear" w:color="auto" w:fill="E8F4FD"/>
+            <w:tcW w:type="dxa" w:w="4680"/>
           </w:tcPr>
           <w:p>
+            <w:pPr>
+              <w:spacing w:before="80" w:after="80"/>
+            </w:pPr>
             <w:r>
+              <w:rPr>
+                <w:sz w:val="19"/>
+              </w:rPr>
               <w:t>Accuracy</w:t>
             </w:r>
           </w:p>
         </w:tc>
         <w:tc>
           <w:tcPr>
-            <w:tcW w:type="dxa" w:w="4533"/>
-            <w:shd w:val="clear" w:color="auto" w:fill="E8F4FD"/>
+            <w:tcW w:type="dxa" w:w="4680"/>
           </w:tcPr>
           <w:p>
+            <w:pPr>
+              <w:spacing w:before="80" w:after="80"/>
+            </w:pPr>
             <w:r>
+              <w:rPr>
+                <w:sz w:val="19"/>
+              </w:rPr>
               <w:t>93.42%</w:t>
             </w:r>
           </w:p>
@@ -1428,20 +2134,34 @@
       <w:tr>
         <w:tc>
           <w:tcPr>
-            <w:tcW w:type="dxa" w:w="4533"/>
+            <w:tcW w:type="dxa" w:w="4680"/>
+            <w:shd w:val="clear" w:color="auto" w:fill="F7FAFC"/>
           </w:tcPr>
           <w:p>
+            <w:pPr>
+              <w:spacing w:before="80" w:after="80"/>
+            </w:pPr>
             <w:r>
+              <w:rPr>
+                <w:sz w:val="19"/>
+              </w:rPr>
               <w:t>AUC-ROC</w:t>
             </w:r>
           </w:p>
         </w:tc>
         <w:tc>
           <w:tcPr>
-            <w:tcW w:type="dxa" w:w="4533"/>
+            <w:tcW w:type="dxa" w:w="4680"/>
+            <w:shd w:val="clear" w:color="auto" w:fill="F7FAFC"/>
           </w:tcPr>
           <w:p>
+            <w:pPr>
+              <w:spacing w:before="80" w:after="80"/>
+            </w:pPr>
             <w:r>
+              <w:rPr>
+                <w:sz w:val="19"/>
+              </w:rPr>
               <w:t>0.9887</w:t>
             </w:r>
           </w:p>
@@ -1451,36 +2171,45 @@
     <w:p/>
     <w:p>
       <w:pPr>
-        <w:pStyle w:val="Heading2"/>
+        <w:spacing w:before="200" w:after="80"/>
       </w:pPr>
       <w:r>
+        <w:rPr>
+          <w:b/>
+          <w:color w:val="2D3748"/>
+          <w:sz w:val="24"/>
+        </w:rPr>
         <w:t>7.2 Comparison with Other Models</w:t>
       </w:r>
     </w:p>
     <w:tbl>
       <w:tblPr>
-        <w:tblStyle w:val="TableGrid"/>
         <w:tblW w:type="auto" w:w="0"/>
+        <w:jc w:val="center"/>
         <w:tblLook w:firstColumn="1" w:firstRow="1" w:lastColumn="0" w:lastRow="0" w:noHBand="0" w:noVBand="1" w:val="04A0"/>
       </w:tblPr>
       <w:tblGrid>
-        <w:gridCol w:w="1813"/>
-        <w:gridCol w:w="1813"/>
-        <w:gridCol w:w="1813"/>
-        <w:gridCol w:w="1813"/>
-        <w:gridCol w:w="1813"/>
+        <w:gridCol w:w="1872"/>
+        <w:gridCol w:w="1872"/>
+        <w:gridCol w:w="1872"/>
+        <w:gridCol w:w="1872"/>
+        <w:gridCol w:w="1872"/>
       </w:tblGrid>
       <w:tr>
         <w:tc>
           <w:tcPr>
-            <w:tcW w:type="dxa" w:w="1813"/>
-            <w:shd w:val="clear" w:color="auto" w:fill="1F77B4"/>
+            <w:tcW w:type="dxa" w:w="1872"/>
+            <w:shd w:val="clear" w:color="auto" w:fill="2B6CB0"/>
           </w:tcPr>
           <w:p>
+            <w:pPr>
+              <w:spacing w:before="80" w:after="80"/>
+            </w:pPr>
             <w:r>
               <w:rPr>
                 <w:b/>
                 <w:color w:val="FFFFFF"/>
+                <w:sz w:val="20"/>
               </w:rPr>
               <w:t>Model</w:t>
             </w:r>
@@ -1488,14 +2217,18 @@
         </w:tc>
         <w:tc>
           <w:tcPr>
-            <w:tcW w:type="dxa" w:w="1813"/>
-            <w:shd w:val="clear" w:color="auto" w:fill="1F77B4"/>
+            <w:tcW w:type="dxa" w:w="1872"/>
+            <w:shd w:val="clear" w:color="auto" w:fill="2B6CB0"/>
           </w:tcPr>
           <w:p>
+            <w:pPr>
+              <w:spacing w:before="80" w:after="80"/>
+            </w:pPr>
             <w:r>
               <w:rPr>
                 <w:b/>
                 <w:color w:val="FFFFFF"/>
+                <w:sz w:val="20"/>
               </w:rPr>
               <w:t>Accuracy</w:t>
             </w:r>
@@ -1503,14 +2236,18 @@
         </w:tc>
         <w:tc>
           <w:tcPr>
-            <w:tcW w:type="dxa" w:w="1813"/>
-            <w:shd w:val="clear" w:color="auto" w:fill="1F77B4"/>
+            <w:tcW w:type="dxa" w:w="1872"/>
+            <w:shd w:val="clear" w:color="auto" w:fill="2B6CB0"/>
           </w:tcPr>
           <w:p>
+            <w:pPr>
+              <w:spacing w:before="80" w:after="80"/>
+            </w:pPr>
             <w:r>
               <w:rPr>
                 <w:b/>
                 <w:color w:val="FFFFFF"/>
+                <w:sz w:val="20"/>
               </w:rPr>
               <w:t>Precision</w:t>
             </w:r>
@@ -1518,14 +2255,18 @@
         </w:tc>
         <w:tc>
           <w:tcPr>
-            <w:tcW w:type="dxa" w:w="1813"/>
-            <w:shd w:val="clear" w:color="auto" w:fill="1F77B4"/>
+            <w:tcW w:type="dxa" w:w="1872"/>
+            <w:shd w:val="clear" w:color="auto" w:fill="2B6CB0"/>
           </w:tcPr>
           <w:p>
+            <w:pPr>
+              <w:spacing w:before="80" w:after="80"/>
+            </w:pPr>
             <w:r>
               <w:rPr>
                 <w:b/>
                 <w:color w:val="FFFFFF"/>
+                <w:sz w:val="20"/>
               </w:rPr>
               <w:t>Recall</w:t>
             </w:r>
@@ -1533,14 +2274,18 @@
         </w:tc>
         <w:tc>
           <w:tcPr>
-            <w:tcW w:type="dxa" w:w="1813"/>
-            <w:shd w:val="clear" w:color="auto" w:fill="1F77B4"/>
+            <w:tcW w:type="dxa" w:w="1872"/>
+            <w:shd w:val="clear" w:color="auto" w:fill="2B6CB0"/>
           </w:tcPr>
           <w:p>
+            <w:pPr>
+              <w:spacing w:before="80" w:after="80"/>
+            </w:pPr>
             <w:r>
               <w:rPr>
                 <w:b/>
                 <w:color w:val="FFFFFF"/>
+                <w:sz w:val="20"/>
               </w:rPr>
               <w:t>F1-Score</w:t>
             </w:r>
@@ -1550,55 +2295,80 @@
       <w:tr>
         <w:tc>
           <w:tcPr>
-            <w:tcW w:type="dxa" w:w="1813"/>
-            <w:shd w:val="clear" w:color="auto" w:fill="E8F4FD"/>
+            <w:tcW w:type="dxa" w:w="1872"/>
           </w:tcPr>
           <w:p>
+            <w:pPr>
+              <w:spacing w:before="80" w:after="80"/>
+            </w:pPr>
             <w:r>
+              <w:rPr>
+                <w:sz w:val="19"/>
+              </w:rPr>
               <w:t>Decision Tree</w:t>
             </w:r>
           </w:p>
         </w:tc>
         <w:tc>
           <w:tcPr>
-            <w:tcW w:type="dxa" w:w="1813"/>
-            <w:shd w:val="clear" w:color="auto" w:fill="E8F4FD"/>
+            <w:tcW w:type="dxa" w:w="1872"/>
           </w:tcPr>
           <w:p>
+            <w:pPr>
+              <w:spacing w:before="80" w:after="80"/>
+            </w:pPr>
             <w:r>
+              <w:rPr>
+                <w:sz w:val="19"/>
+              </w:rPr>
               <w:t>97.81%</w:t>
             </w:r>
           </w:p>
         </w:tc>
         <w:tc>
           <w:tcPr>
-            <w:tcW w:type="dxa" w:w="1813"/>
-            <w:shd w:val="clear" w:color="auto" w:fill="E8F4FD"/>
+            <w:tcW w:type="dxa" w:w="1872"/>
           </w:tcPr>
           <w:p>
+            <w:pPr>
+              <w:spacing w:before="80" w:after="80"/>
+            </w:pPr>
             <w:r>
+              <w:rPr>
+                <w:sz w:val="19"/>
+              </w:rPr>
               <w:t>98.78%</w:t>
             </w:r>
           </w:p>
         </w:tc>
         <w:tc>
           <w:tcPr>
-            <w:tcW w:type="dxa" w:w="1813"/>
-            <w:shd w:val="clear" w:color="auto" w:fill="E8F4FD"/>
+            <w:tcW w:type="dxa" w:w="1872"/>
           </w:tcPr>
           <w:p>
+            <w:pPr>
+              <w:spacing w:before="80" w:after="80"/>
+            </w:pPr>
             <w:r>
+              <w:rPr>
+                <w:sz w:val="19"/>
+              </w:rPr>
               <w:t>95.29%</w:t>
             </w:r>
           </w:p>
         </w:tc>
         <w:tc>
           <w:tcPr>
-            <w:tcW w:type="dxa" w:w="1813"/>
-            <w:shd w:val="clear" w:color="auto" w:fill="E8F4FD"/>
+            <w:tcW w:type="dxa" w:w="1872"/>
           </w:tcPr>
           <w:p>
+            <w:pPr>
+              <w:spacing w:before="80" w:after="80"/>
+            </w:pPr>
             <w:r>
+              <w:rPr>
+                <w:sz w:val="19"/>
+              </w:rPr>
               <w:t>97.01%</w:t>
             </w:r>
           </w:p>
@@ -1607,50 +2377,85 @@
       <w:tr>
         <w:tc>
           <w:tcPr>
-            <w:tcW w:type="dxa" w:w="1813"/>
+            <w:tcW w:type="dxa" w:w="1872"/>
+            <w:shd w:val="clear" w:color="auto" w:fill="F7FAFC"/>
           </w:tcPr>
           <w:p>
+            <w:pPr>
+              <w:spacing w:before="80" w:after="80"/>
+            </w:pPr>
             <w:r>
+              <w:rPr>
+                <w:sz w:val="19"/>
+              </w:rPr>
               <w:t>Random Forest</w:t>
             </w:r>
           </w:p>
         </w:tc>
         <w:tc>
           <w:tcPr>
-            <w:tcW w:type="dxa" w:w="1813"/>
+            <w:tcW w:type="dxa" w:w="1872"/>
+            <w:shd w:val="clear" w:color="auto" w:fill="F7FAFC"/>
           </w:tcPr>
           <w:p>
+            <w:pPr>
+              <w:spacing w:before="80" w:after="80"/>
+            </w:pPr>
             <w:r>
+              <w:rPr>
+                <w:sz w:val="19"/>
+              </w:rPr>
               <w:t>99.12%</w:t>
             </w:r>
           </w:p>
         </w:tc>
         <w:tc>
           <w:tcPr>
-            <w:tcW w:type="dxa" w:w="1813"/>
+            <w:tcW w:type="dxa" w:w="1872"/>
+            <w:shd w:val="clear" w:color="auto" w:fill="F7FAFC"/>
           </w:tcPr>
           <w:p>
+            <w:pPr>
+              <w:spacing w:before="80" w:after="80"/>
+            </w:pPr>
             <w:r>
+              <w:rPr>
+                <w:sz w:val="19"/>
+              </w:rPr>
               <w:t>100.00%</w:t>
             </w:r>
           </w:p>
         </w:tc>
         <w:tc>
           <w:tcPr>
-            <w:tcW w:type="dxa" w:w="1813"/>
+            <w:tcW w:type="dxa" w:w="1872"/>
+            <w:shd w:val="clear" w:color="auto" w:fill="F7FAFC"/>
           </w:tcPr>
           <w:p>
+            <w:pPr>
+              <w:spacing w:before="80" w:after="80"/>
+            </w:pPr>
             <w:r>
+              <w:rPr>
+                <w:sz w:val="19"/>
+              </w:rPr>
               <w:t>97.65%</w:t>
             </w:r>
           </w:p>
         </w:tc>
         <w:tc>
           <w:tcPr>
-            <w:tcW w:type="dxa" w:w="1813"/>
+            <w:tcW w:type="dxa" w:w="1872"/>
+            <w:shd w:val="clear" w:color="auto" w:fill="F7FAFC"/>
           </w:tcPr>
           <w:p>
+            <w:pPr>
+              <w:spacing w:before="80" w:after="80"/>
+            </w:pPr>
             <w:r>
+              <w:rPr>
+                <w:sz w:val="19"/>
+              </w:rPr>
               <w:t>98.81%</w:t>
             </w:r>
           </w:p>
@@ -1659,55 +2464,80 @@
       <w:tr>
         <w:tc>
           <w:tcPr>
-            <w:tcW w:type="dxa" w:w="1813"/>
-            <w:shd w:val="clear" w:color="auto" w:fill="E8F4FD"/>
+            <w:tcW w:type="dxa" w:w="1872"/>
           </w:tcPr>
           <w:p>
+            <w:pPr>
+              <w:spacing w:before="80" w:after="80"/>
+            </w:pPr>
             <w:r>
+              <w:rPr>
+                <w:sz w:val="19"/>
+              </w:rPr>
               <w:t>Logistic Regression</w:t>
             </w:r>
           </w:p>
         </w:tc>
         <w:tc>
           <w:tcPr>
-            <w:tcW w:type="dxa" w:w="1813"/>
-            <w:shd w:val="clear" w:color="auto" w:fill="E8F4FD"/>
+            <w:tcW w:type="dxa" w:w="1872"/>
           </w:tcPr>
           <w:p>
+            <w:pPr>
+              <w:spacing w:before="80" w:after="80"/>
+            </w:pPr>
             <w:r>
+              <w:rPr>
+                <w:sz w:val="19"/>
+              </w:rPr>
               <w:t>93.42%</w:t>
             </w:r>
           </w:p>
         </w:tc>
         <w:tc>
           <w:tcPr>
-            <w:tcW w:type="dxa" w:w="1813"/>
-            <w:shd w:val="clear" w:color="auto" w:fill="E8F4FD"/>
+            <w:tcW w:type="dxa" w:w="1872"/>
           </w:tcPr>
           <w:p>
+            <w:pPr>
+              <w:spacing w:before="80" w:after="80"/>
+            </w:pPr>
             <w:r>
+              <w:rPr>
+                <w:sz w:val="19"/>
+              </w:rPr>
               <w:t>91–95%</w:t>
             </w:r>
           </w:p>
         </w:tc>
         <w:tc>
           <w:tcPr>
-            <w:tcW w:type="dxa" w:w="1813"/>
-            <w:shd w:val="clear" w:color="auto" w:fill="E8F4FD"/>
+            <w:tcW w:type="dxa" w:w="1872"/>
           </w:tcPr>
           <w:p>
+            <w:pPr>
+              <w:spacing w:before="80" w:after="80"/>
+            </w:pPr>
             <w:r>
+              <w:rPr>
+                <w:sz w:val="19"/>
+              </w:rPr>
               <w:t>89–95%</w:t>
             </w:r>
           </w:p>
         </w:tc>
         <w:tc>
           <w:tcPr>
-            <w:tcW w:type="dxa" w:w="1813"/>
-            <w:shd w:val="clear" w:color="auto" w:fill="E8F4FD"/>
+            <w:tcW w:type="dxa" w:w="1872"/>
           </w:tcPr>
           <w:p>
+            <w:pPr>
+              <w:spacing w:before="80" w:after="80"/>
+            </w:pPr>
             <w:r>
+              <w:rPr>
+                <w:sz w:val="19"/>
+              </w:rPr>
               <w:t>90–95%</w:t>
             </w:r>
           </w:p>
@@ -1717,20 +2547,26 @@
     <w:p/>
     <w:p>
       <w:pPr>
-        <w:pStyle w:val="Heading2"/>
+        <w:spacing w:before="200" w:after="80"/>
       </w:pPr>
       <w:r>
+        <w:rPr>
+          <w:b/>
+          <w:color w:val="2D3748"/>
+          <w:sz w:val="24"/>
+        </w:rPr>
         <w:t>7.3 Confusion Matrix</w:t>
       </w:r>
     </w:p>
     <w:p>
       <w:pPr>
+        <w:spacing w:after="240"/>
         <w:jc w:val="center"/>
       </w:pPr>
       <w:r>
         <w:drawing>
           <wp:inline xmlns:a="http://schemas.openxmlformats.org/drawingml/2006/main" xmlns:pic="http://schemas.openxmlformats.org/drawingml/2006/picture">
-            <wp:extent cx="3657600" cy="2992582"/>
+            <wp:extent cx="5029200" cy="4114800"/>
             <wp:docPr id="1" name="Picture 1"/>
             <wp:cNvGraphicFramePr>
               <a:graphicFrameLocks noChangeAspect="1"/>
@@ -1751,7 +2587,7 @@
                   <pic:spPr>
                     <a:xfrm>
                       <a:off x="0" y="0"/>
-                      <a:ext cx="3657600" cy="2992582"/>
+                      <a:ext cx="5029200" cy="4114800"/>
                     </a:xfrm>
                     <a:prstGeom prst="rect"/>
                   </pic:spPr>
@@ -1763,35 +2599,54 @@
       </w:r>
     </w:p>
     <w:p>
+      <w:pPr>
+        <w:spacing w:after="120"/>
+      </w:pPr>
+      <w:r/>
       <w:r>
-        <w:t>Figure: Confusion Matrix — Logistic Regression on test set (228 samples).</w:t>
+        <w:rPr>
+          <w:i/>
+        </w:rPr>
+        <w:t>Malignant tumors correctly identified with high sensitivity, minimizing false negatives.</w:t>
       </w:r>
+      <w:r/>
     </w:p>
     <w:p>
       <w:pPr>
-        <w:pStyle w:val="Heading1"/>
+        <w:spacing w:before="280" w:after="120"/>
       </w:pPr>
       <w:r>
+        <w:rPr>
+          <w:b/>
+          <w:color w:val="2B6CB0"/>
+          <w:sz w:val="30"/>
+        </w:rPr>
         <w:t>8. Model Report</w:t>
       </w:r>
     </w:p>
     <w:p>
       <w:pPr>
-        <w:pStyle w:val="Heading2"/>
+        <w:spacing w:before="200" w:after="80"/>
       </w:pPr>
       <w:r>
-        <w:t>8.1 Full Classification Report</w:t>
+        <w:rPr>
+          <w:b/>
+          <w:color w:val="2D3748"/>
+          <w:sz w:val="24"/>
+        </w:rPr>
+        <w:t>8.1 Full Classification Report (Logistic Regression)</w:t>
       </w:r>
     </w:p>
     <w:p>
       <w:pPr>
-        <w:ind w:left="567"/>
-        <w:shd w:val="clear" w:color="auto" w:fill="F2F2F2"/>
+        <w:spacing w:before="120" w:after="120"/>
+        <w:ind w:left="288"/>
       </w:pPr>
       <w:r>
         <w:rPr>
-          <w:rFonts w:ascii="Courier New" w:hAnsi="Courier New"/>
-          <w:sz w:val="18"/>
+          <w:rFonts w:ascii="Consolas" w:hAnsi="Consolas"/>
+          <w:color w:val="1A202C"/>
+          <w:sz w:val="19"/>
         </w:rPr>
         <w:t xml:space="preserve">              precision    recall  f1-score   support</w:t>
         <w:br/>
@@ -1806,18 +2661,25 @@
         <w:t xml:space="preserve">   macro avg       0.93      0.92      0.93       228</w:t>
         <w:br/>
         <w:t>weighted avg       0.93      0.93      0.93       228</w:t>
+        <w:br/>
       </w:r>
     </w:p>
     <w:p>
       <w:pPr>
-        <w:pStyle w:val="Heading2"/>
+        <w:spacing w:before="200" w:after="80"/>
       </w:pPr>
       <w:r>
+        <w:rPr>
+          <w:b/>
+          <w:color w:val="2D3748"/>
+          <w:sz w:val="24"/>
+        </w:rPr>
         <w:t>8.2 Feature Coefficients</w:t>
       </w:r>
     </w:p>
     <w:p>
       <w:pPr>
+        <w:spacing w:after="240"/>
         <w:jc w:val="center"/>
       </w:pPr>
       <w:r>
@@ -1857,25 +2719,29 @@
     </w:p>
     <w:tbl>
       <w:tblPr>
-        <w:tblStyle w:val="TableGrid"/>
         <w:tblW w:type="auto" w:w="0"/>
+        <w:jc w:val="center"/>
         <w:tblLook w:firstColumn="1" w:firstRow="1" w:lastColumn="0" w:lastRow="0" w:noHBand="0" w:noVBand="1" w:val="04A0"/>
       </w:tblPr>
       <w:tblGrid>
-        <w:gridCol w:w="4533"/>
-        <w:gridCol w:w="4533"/>
+        <w:gridCol w:w="4680"/>
+        <w:gridCol w:w="4680"/>
       </w:tblGrid>
       <w:tr>
         <w:tc>
           <w:tcPr>
-            <w:tcW w:type="dxa" w:w="4533"/>
-            <w:shd w:val="clear" w:color="auto" w:fill="1F77B4"/>
+            <w:tcW w:type="dxa" w:w="4680"/>
+            <w:shd w:val="clear" w:color="auto" w:fill="2B6CB0"/>
           </w:tcPr>
           <w:p>
+            <w:pPr>
+              <w:spacing w:before="80" w:after="80"/>
+            </w:pPr>
             <w:r>
               <w:rPr>
                 <w:b/>
                 <w:color w:val="FFFFFF"/>
+                <w:sz w:val="20"/>
               </w:rPr>
               <w:t>Feature</w:t>
             </w:r>
@@ -1883,14 +2749,18 @@
         </w:tc>
         <w:tc>
           <w:tcPr>
-            <w:tcW w:type="dxa" w:w="4533"/>
-            <w:shd w:val="clear" w:color="auto" w:fill="1F77B4"/>
+            <w:tcW w:type="dxa" w:w="4680"/>
+            <w:shd w:val="clear" w:color="auto" w:fill="2B6CB0"/>
           </w:tcPr>
           <w:p>
+            <w:pPr>
+              <w:spacing w:before="80" w:after="80"/>
+            </w:pPr>
             <w:r>
               <w:rPr>
                 <w:b/>
                 <w:color w:val="FFFFFF"/>
+                <w:sz w:val="20"/>
               </w:rPr>
               <w:t>Interpretation</w:t>
             </w:r>
@@ -1900,22 +2770,32 @@
       <w:tr>
         <w:tc>
           <w:tcPr>
-            <w:tcW w:type="dxa" w:w="4533"/>
-            <w:shd w:val="clear" w:color="auto" w:fill="E8F4FD"/>
+            <w:tcW w:type="dxa" w:w="4680"/>
           </w:tcPr>
           <w:p>
+            <w:pPr>
+              <w:spacing w:before="80" w:after="80"/>
+            </w:pPr>
             <w:r>
+              <w:rPr>
+                <w:sz w:val="19"/>
+              </w:rPr>
               <w:t>concave points_mean</w:t>
             </w:r>
           </w:p>
         </w:tc>
         <w:tc>
           <w:tcPr>
-            <w:tcW w:type="dxa" w:w="4533"/>
-            <w:shd w:val="clear" w:color="auto" w:fill="E8F4FD"/>
+            <w:tcW w:type="dxa" w:w="4680"/>
           </w:tcPr>
           <w:p>
+            <w:pPr>
+              <w:spacing w:before="80" w:after="80"/>
+            </w:pPr>
             <w:r>
+              <w:rPr>
+                <w:sz w:val="19"/>
+              </w:rPr>
               <w:t>Strongest predictor — higher value → malignant</w:t>
             </w:r>
           </w:p>
@@ -1924,20 +2804,34 @@
       <w:tr>
         <w:tc>
           <w:tcPr>
-            <w:tcW w:type="dxa" w:w="4533"/>
+            <w:tcW w:type="dxa" w:w="4680"/>
+            <w:shd w:val="clear" w:color="auto" w:fill="F7FAFC"/>
           </w:tcPr>
           <w:p>
+            <w:pPr>
+              <w:spacing w:before="80" w:after="80"/>
+            </w:pPr>
             <w:r>
+              <w:rPr>
+                <w:sz w:val="19"/>
+              </w:rPr>
               <w:t>radius_mean</w:t>
             </w:r>
           </w:p>
         </w:tc>
         <w:tc>
           <w:tcPr>
-            <w:tcW w:type="dxa" w:w="4533"/>
+            <w:tcW w:type="dxa" w:w="4680"/>
+            <w:shd w:val="clear" w:color="auto" w:fill="F7FAFC"/>
           </w:tcPr>
           <w:p>
+            <w:pPr>
+              <w:spacing w:before="80" w:after="80"/>
+            </w:pPr>
             <w:r>
+              <w:rPr>
+                <w:sz w:val="19"/>
+              </w:rPr>
               <w:t>Larger radius strongly predicts malignancy</w:t>
             </w:r>
           </w:p>
@@ -1946,22 +2840,32 @@
       <w:tr>
         <w:tc>
           <w:tcPr>
-            <w:tcW w:type="dxa" w:w="4533"/>
-            <w:shd w:val="clear" w:color="auto" w:fill="E8F4FD"/>
+            <w:tcW w:type="dxa" w:w="4680"/>
           </w:tcPr>
           <w:p>
+            <w:pPr>
+              <w:spacing w:before="80" w:after="80"/>
+            </w:pPr>
             <w:r>
+              <w:rPr>
+                <w:sz w:val="19"/>
+              </w:rPr>
               <w:t>compactness_mean</w:t>
             </w:r>
           </w:p>
         </w:tc>
         <w:tc>
           <w:tcPr>
-            <w:tcW w:type="dxa" w:w="4533"/>
-            <w:shd w:val="clear" w:color="auto" w:fill="E8F4FD"/>
+            <w:tcW w:type="dxa" w:w="4680"/>
           </w:tcPr>
           <w:p>
+            <w:pPr>
+              <w:spacing w:before="80" w:after="80"/>
+            </w:pPr>
             <w:r>
+              <w:rPr>
+                <w:sz w:val="19"/>
+              </w:rPr>
               <w:t>Shape irregularity increases risk</w:t>
             </w:r>
           </w:p>
@@ -1970,20 +2874,34 @@
       <w:tr>
         <w:tc>
           <w:tcPr>
-            <w:tcW w:type="dxa" w:w="4533"/>
+            <w:tcW w:type="dxa" w:w="4680"/>
+            <w:shd w:val="clear" w:color="auto" w:fill="F7FAFC"/>
           </w:tcPr>
           <w:p>
+            <w:pPr>
+              <w:spacing w:before="80" w:after="80"/>
+            </w:pPr>
             <w:r>
+              <w:rPr>
+                <w:sz w:val="19"/>
+              </w:rPr>
               <w:t>texture_mean</w:t>
             </w:r>
           </w:p>
         </w:tc>
         <w:tc>
           <w:tcPr>
-            <w:tcW w:type="dxa" w:w="4533"/>
+            <w:tcW w:type="dxa" w:w="4680"/>
+            <w:shd w:val="clear" w:color="auto" w:fill="F7FAFC"/>
           </w:tcPr>
           <w:p>
+            <w:pPr>
+              <w:spacing w:before="80" w:after="80"/>
+            </w:pPr>
             <w:r>
+              <w:rPr>
+                <w:sz w:val="19"/>
+              </w:rPr>
               <w:t>Texture variance — moderate predictor</w:t>
             </w:r>
           </w:p>
@@ -1992,22 +2910,32 @@
       <w:tr>
         <w:tc>
           <w:tcPr>
-            <w:tcW w:type="dxa" w:w="4533"/>
-            <w:shd w:val="clear" w:color="auto" w:fill="E8F4FD"/>
+            <w:tcW w:type="dxa" w:w="4680"/>
           </w:tcPr>
           <w:p>
+            <w:pPr>
+              <w:spacing w:before="80" w:after="80"/>
+            </w:pPr>
             <w:r>
+              <w:rPr>
+                <w:sz w:val="19"/>
+              </w:rPr>
               <w:t>smoothness_mean</w:t>
             </w:r>
           </w:p>
         </w:tc>
         <w:tc>
           <w:tcPr>
-            <w:tcW w:type="dxa" w:w="4533"/>
-            <w:shd w:val="clear" w:color="auto" w:fill="E8F4FD"/>
+            <w:tcW w:type="dxa" w:w="4680"/>
           </w:tcPr>
           <w:p>
+            <w:pPr>
+              <w:spacing w:before="80" w:after="80"/>
+            </w:pPr>
             <w:r>
+              <w:rPr>
+                <w:sz w:val="19"/>
+              </w:rPr>
               <w:t>Weak but consistent signal</w:t>
             </w:r>
           </w:p>
@@ -2016,20 +2944,34 @@
       <w:tr>
         <w:tc>
           <w:tcPr>
-            <w:tcW w:type="dxa" w:w="4533"/>
+            <w:tcW w:type="dxa" w:w="4680"/>
+            <w:shd w:val="clear" w:color="auto" w:fill="F7FAFC"/>
           </w:tcPr>
           <w:p>
+            <w:pPr>
+              <w:spacing w:before="80" w:after="80"/>
+            </w:pPr>
             <w:r>
+              <w:rPr>
+                <w:sz w:val="19"/>
+              </w:rPr>
               <w:t>symmetry_mean</w:t>
             </w:r>
           </w:p>
         </w:tc>
         <w:tc>
           <w:tcPr>
-            <w:tcW w:type="dxa" w:w="4533"/>
+            <w:tcW w:type="dxa" w:w="4680"/>
+            <w:shd w:val="clear" w:color="auto" w:fill="F7FAFC"/>
           </w:tcPr>
           <w:p>
+            <w:pPr>
+              <w:spacing w:before="80" w:after="80"/>
+            </w:pPr>
             <w:r>
+              <w:rPr>
+                <w:sz w:val="19"/>
+              </w:rPr>
               <w:t>Least significant feature</w:t>
             </w:r>
           </w:p>
@@ -2039,14 +2981,20 @@
     <w:p/>
     <w:p>
       <w:pPr>
-        <w:pStyle w:val="Heading1"/>
+        <w:spacing w:before="280" w:after="120"/>
       </w:pPr>
       <w:r>
+        <w:rPr>
+          <w:b/>
+          <w:color w:val="2B6CB0"/>
+          <w:sz w:val="30"/>
+        </w:rPr>
         <w:t>9. ROC Curve</w:t>
       </w:r>
     </w:p>
     <w:p>
       <w:pPr>
+        <w:spacing w:after="240"/>
         <w:jc w:val="center"/>
       </w:pPr>
       <w:r>
@@ -2086,25 +3034,29 @@
     </w:p>
     <w:tbl>
       <w:tblPr>
-        <w:tblStyle w:val="TableGrid"/>
         <w:tblW w:type="auto" w:w="0"/>
+        <w:jc w:val="center"/>
         <w:tblLook w:firstColumn="1" w:firstRow="1" w:lastColumn="0" w:lastRow="0" w:noHBand="0" w:noVBand="1" w:val="04A0"/>
       </w:tblPr>
       <w:tblGrid>
-        <w:gridCol w:w="4533"/>
-        <w:gridCol w:w="4533"/>
+        <w:gridCol w:w="4680"/>
+        <w:gridCol w:w="4680"/>
       </w:tblGrid>
       <w:tr>
         <w:tc>
           <w:tcPr>
-            <w:tcW w:type="dxa" w:w="4533"/>
-            <w:shd w:val="clear" w:color="auto" w:fill="1F77B4"/>
+            <w:tcW w:type="dxa" w:w="4680"/>
+            <w:shd w:val="clear" w:color="auto" w:fill="2B6CB0"/>
           </w:tcPr>
           <w:p>
+            <w:pPr>
+              <w:spacing w:before="80" w:after="80"/>
+            </w:pPr>
             <w:r>
               <w:rPr>
                 <w:b/>
                 <w:color w:val="FFFFFF"/>
+                <w:sz w:val="20"/>
               </w:rPr>
               <w:t>Metric</w:t>
             </w:r>
@@ -2112,14 +3064,18 @@
         </w:tc>
         <w:tc>
           <w:tcPr>
-            <w:tcW w:type="dxa" w:w="4533"/>
-            <w:shd w:val="clear" w:color="auto" w:fill="1F77B4"/>
+            <w:tcW w:type="dxa" w:w="4680"/>
+            <w:shd w:val="clear" w:color="auto" w:fill="2B6CB0"/>
           </w:tcPr>
           <w:p>
+            <w:pPr>
+              <w:spacing w:before="80" w:after="80"/>
+            </w:pPr>
             <w:r>
               <w:rPr>
                 <w:b/>
                 <w:color w:val="FFFFFF"/>
+                <w:sz w:val="20"/>
               </w:rPr>
               <w:t>Value</w:t>
             </w:r>
@@ -2129,22 +3085,32 @@
       <w:tr>
         <w:tc>
           <w:tcPr>
-            <w:tcW w:type="dxa" w:w="4533"/>
-            <w:shd w:val="clear" w:color="auto" w:fill="E8F4FD"/>
+            <w:tcW w:type="dxa" w:w="4680"/>
           </w:tcPr>
           <w:p>
+            <w:pPr>
+              <w:spacing w:before="80" w:after="80"/>
+            </w:pPr>
             <w:r>
+              <w:rPr>
+                <w:sz w:val="19"/>
+              </w:rPr>
               <w:t>AUC (Area Under Curve)</w:t>
             </w:r>
           </w:p>
         </w:tc>
         <w:tc>
           <w:tcPr>
-            <w:tcW w:type="dxa" w:w="4533"/>
-            <w:shd w:val="clear" w:color="auto" w:fill="E8F4FD"/>
+            <w:tcW w:type="dxa" w:w="4680"/>
           </w:tcPr>
           <w:p>
+            <w:pPr>
+              <w:spacing w:before="80" w:after="80"/>
+            </w:pPr>
             <w:r>
+              <w:rPr>
+                <w:sz w:val="19"/>
+              </w:rPr>
               <w:t>0.9887</w:t>
             </w:r>
           </w:p>
@@ -2153,20 +3119,34 @@
       <w:tr>
         <w:tc>
           <w:tcPr>
-            <w:tcW w:type="dxa" w:w="4533"/>
+            <w:tcW w:type="dxa" w:w="4680"/>
+            <w:shd w:val="clear" w:color="auto" w:fill="F7FAFC"/>
           </w:tcPr>
           <w:p>
+            <w:pPr>
+              <w:spacing w:before="80" w:after="80"/>
+            </w:pPr>
             <w:r>
+              <w:rPr>
+                <w:sz w:val="19"/>
+              </w:rPr>
               <w:t>Random Classifier AUC</w:t>
             </w:r>
           </w:p>
         </w:tc>
         <w:tc>
           <w:tcPr>
-            <w:tcW w:type="dxa" w:w="4533"/>
+            <w:tcW w:type="dxa" w:w="4680"/>
+            <w:shd w:val="clear" w:color="auto" w:fill="F7FAFC"/>
           </w:tcPr>
           <w:p>
+            <w:pPr>
+              <w:spacing w:before="80" w:after="80"/>
+            </w:pPr>
             <w:r>
+              <w:rPr>
+                <w:sz w:val="19"/>
+              </w:rPr>
               <w:t>0.5000</w:t>
             </w:r>
           </w:p>
@@ -2175,34 +3155,57 @@
     </w:tbl>
     <w:p/>
     <w:p>
+      <w:pPr>
+        <w:spacing w:after="120"/>
+      </w:pPr>
       <w:r>
-        <w:t>AUC of 0.9887 confirms near-perfect discriminatory power between Malignant and Benign tumors. The sigmoid probability output allows clinicians to set custom decision thresholds based on clinical risk tolerance.</w:t>
+        <w:t xml:space="preserve">The ROC curve plots True Positive Rate (Sensitivity) vs False Positive Rate at all classification thresholds. An AUC of </w:t>
+      </w:r>
+      <w:r>
+        <w:rPr>
+          <w:b/>
+        </w:rPr>
+        <w:t>0.9887</w:t>
+      </w:r>
+      <w:r>
+        <w:t xml:space="preserve"> confirms the model has near-perfect discriminatory power between Malignant and Benign tumors, even while overall accuracy is 93.42% (due to the imbalanced test set).</w:t>
       </w:r>
     </w:p>
     <w:p>
       <w:pPr>
-        <w:pStyle w:val="Heading1"/>
+        <w:spacing w:before="280" w:after="120"/>
       </w:pPr>
       <w:r>
+        <w:rPr>
+          <w:b/>
+          <w:color w:val="2B6CB0"/>
+          <w:sz w:val="30"/>
+        </w:rPr>
         <w:t>10. Visualizations</w:t>
       </w:r>
     </w:p>
     <w:p>
       <w:pPr>
-        <w:pStyle w:val="Heading2"/>
+        <w:spacing w:before="200" w:after="80"/>
       </w:pPr>
       <w:r>
-        <w:t>10.1 Bar Chart — Diagnosis Count</w:t>
+        <w:rPr>
+          <w:b/>
+          <w:color w:val="2D3748"/>
+          <w:sz w:val="24"/>
+        </w:rPr>
+        <w:t>10.1 Bar Chart — Diagnosis Class Distribution</w:t>
       </w:r>
     </w:p>
     <w:p>
       <w:pPr>
+        <w:spacing w:after="240"/>
         <w:jc w:val="center"/>
       </w:pPr>
       <w:r>
         <w:drawing>
           <wp:inline xmlns:a="http://schemas.openxmlformats.org/drawingml/2006/main" xmlns:pic="http://schemas.openxmlformats.org/drawingml/2006/picture">
-            <wp:extent cx="4754880" cy="3056709"/>
+            <wp:extent cx="5029200" cy="3233057"/>
             <wp:docPr id="4" name="Picture 4"/>
             <wp:cNvGraphicFramePr>
               <a:graphicFrameLocks noChangeAspect="1"/>
@@ -2223,7 +3226,7 @@
                   <pic:spPr>
                     <a:xfrm>
                       <a:off x="0" y="0"/>
-                      <a:ext cx="4754880" cy="3056709"/>
+                      <a:ext cx="5029200" cy="3233057"/>
                     </a:xfrm>
                     <a:prstGeom prst="rect"/>
                   </pic:spPr>
@@ -2235,27 +3238,40 @@
       </w:r>
     </w:p>
     <w:p>
+      <w:pPr>
+        <w:spacing w:after="120"/>
+      </w:pPr>
+      <w:r/>
       <w:r>
-        <w:t>Figure: 714 Benign vs 424 Malignant records.</w:t>
+        <w:rPr>
+          <w:i/>
+        </w:rPr>
+        <w:t>714 Benign vs 424 Malignant records across the augmented dataset.</w:t>
       </w:r>
+      <w:r/>
     </w:p>
-    <w:p/>
     <w:p>
       <w:pPr>
-        <w:pStyle w:val="Heading2"/>
+        <w:spacing w:before="200" w:after="80"/>
       </w:pPr>
       <w:r>
+        <w:rPr>
+          <w:b/>
+          <w:color w:val="2D3748"/>
+          <w:sz w:val="24"/>
+        </w:rPr>
         <w:t>10.2 Pie Chart — Diagnosis Ratio</w:t>
       </w:r>
     </w:p>
     <w:p>
       <w:pPr>
+        <w:spacing w:after="240"/>
         <w:jc w:val="center"/>
       </w:pPr>
       <w:r>
         <w:drawing>
           <wp:inline xmlns:a="http://schemas.openxmlformats.org/drawingml/2006/main" xmlns:pic="http://schemas.openxmlformats.org/drawingml/2006/picture">
-            <wp:extent cx="4754880" cy="4754880"/>
+            <wp:extent cx="5029200" cy="5029200"/>
             <wp:docPr id="5" name="Picture 5"/>
             <wp:cNvGraphicFramePr>
               <a:graphicFrameLocks noChangeAspect="1"/>
@@ -2276,7 +3292,7 @@
                   <pic:spPr>
                     <a:xfrm>
                       <a:off x="0" y="0"/>
-                      <a:ext cx="4754880" cy="4754880"/>
+                      <a:ext cx="5029200" cy="5029200"/>
                     </a:xfrm>
                     <a:prstGeom prst="rect"/>
                   </pic:spPr>
@@ -2288,27 +3304,40 @@
       </w:r>
     </w:p>
     <w:p>
+      <w:pPr>
+        <w:spacing w:after="120"/>
+      </w:pPr>
+      <w:r/>
       <w:r>
-        <w:t>Figure: 62.7% Benign and 37.3% Malignant.</w:t>
+        <w:rPr>
+          <w:i/>
+        </w:rPr>
+        <w:t>62.7% Benign and 37.3% Malignant — mild class imbalance.</w:t>
       </w:r>
+      <w:r/>
     </w:p>
-    <w:p/>
     <w:p>
       <w:pPr>
-        <w:pStyle w:val="Heading2"/>
+        <w:spacing w:before="200" w:after="80"/>
       </w:pPr>
       <w:r>
-        <w:t>10.3 Histogram — Radius Mean</w:t>
+        <w:rPr>
+          <w:b/>
+          <w:color w:val="2D3748"/>
+          <w:sz w:val="24"/>
+        </w:rPr>
+        <w:t>10.3 Histogram — Radius Mean Distribution</w:t>
       </w:r>
     </w:p>
     <w:p>
       <w:pPr>
+        <w:spacing w:after="240"/>
         <w:jc w:val="center"/>
       </w:pPr>
       <w:r>
         <w:drawing>
           <wp:inline xmlns:a="http://schemas.openxmlformats.org/drawingml/2006/main" xmlns:pic="http://schemas.openxmlformats.org/drawingml/2006/picture">
-            <wp:extent cx="4754880" cy="2674620"/>
+            <wp:extent cx="5029200" cy="2828925"/>
             <wp:docPr id="6" name="Picture 6"/>
             <wp:cNvGraphicFramePr>
               <a:graphicFrameLocks noChangeAspect="1"/>
@@ -2329,7 +3358,7 @@
                   <pic:spPr>
                     <a:xfrm>
                       <a:off x="0" y="0"/>
-                      <a:ext cx="4754880" cy="2674620"/>
+                      <a:ext cx="5029200" cy="2828925"/>
                     </a:xfrm>
                     <a:prstGeom prst="rect"/>
                   </pic:spPr>
@@ -2341,27 +3370,40 @@
       </w:r>
     </w:p>
     <w:p>
+      <w:pPr>
+        <w:spacing w:after="120"/>
+      </w:pPr>
+      <w:r/>
       <w:r>
-        <w:t>Figure: Malignant tumors have larger radius mean.</w:t>
+        <w:rPr>
+          <w:i/>
+        </w:rPr>
+        <w:t>Malignant tumors have significantly larger radius mean values than benign.</w:t>
       </w:r>
+      <w:r/>
     </w:p>
-    <w:p/>
     <w:p>
       <w:pPr>
-        <w:pStyle w:val="Heading2"/>
+        <w:spacing w:before="200" w:after="80"/>
       </w:pPr>
       <w:r>
-        <w:t>10.4 Box Plot — Area by Diagnosis</w:t>
+        <w:rPr>
+          <w:b/>
+          <w:color w:val="2D3748"/>
+          <w:sz w:val="24"/>
+        </w:rPr>
+        <w:t>10.4 Box Plot — Area Mean by Diagnosis</w:t>
       </w:r>
     </w:p>
     <w:p>
       <w:pPr>
+        <w:spacing w:after="240"/>
         <w:jc w:val="center"/>
       </w:pPr>
       <w:r>
         <w:drawing>
           <wp:inline xmlns:a="http://schemas.openxmlformats.org/drawingml/2006/main" xmlns:pic="http://schemas.openxmlformats.org/drawingml/2006/picture">
-            <wp:extent cx="4754880" cy="2852928"/>
+            <wp:extent cx="5029200" cy="3017520"/>
             <wp:docPr id="7" name="Picture 7"/>
             <wp:cNvGraphicFramePr>
               <a:graphicFrameLocks noChangeAspect="1"/>
@@ -2382,7 +3424,7 @@
                   <pic:spPr>
                     <a:xfrm>
                       <a:off x="0" y="0"/>
-                      <a:ext cx="4754880" cy="2852928"/>
+                      <a:ext cx="5029200" cy="3017520"/>
                     </a:xfrm>
                     <a:prstGeom prst="rect"/>
                   </pic:spPr>
@@ -2394,27 +3436,40 @@
       </w:r>
     </w:p>
     <w:p>
+      <w:pPr>
+        <w:spacing w:after="120"/>
+      </w:pPr>
+      <w:r/>
       <w:r>
-        <w:t>Figure: Malignant tumors: higher area, wider variance.</w:t>
+        <w:rPr>
+          <w:i/>
+        </w:rPr>
+        <w:t>Malignant tumors show higher area mean and wider variance (more outliers).</w:t>
       </w:r>
+      <w:r/>
     </w:p>
-    <w:p/>
     <w:p>
       <w:pPr>
-        <w:pStyle w:val="Heading2"/>
+        <w:spacing w:before="200" w:after="80"/>
       </w:pPr>
       <w:r>
-        <w:t>10.5 Scatter Plot</w:t>
+        <w:rPr>
+          <w:b/>
+          <w:color w:val="2D3748"/>
+          <w:sz w:val="24"/>
+        </w:rPr>
+        <w:t>10.5 Scatter Plot — Radius Mean vs. Texture Mean</w:t>
       </w:r>
     </w:p>
     <w:p>
       <w:pPr>
+        <w:spacing w:after="240"/>
         <w:jc w:val="center"/>
       </w:pPr>
       <w:r>
         <w:drawing>
           <wp:inline xmlns:a="http://schemas.openxmlformats.org/drawingml/2006/main" xmlns:pic="http://schemas.openxmlformats.org/drawingml/2006/picture">
-            <wp:extent cx="4754880" cy="2674620"/>
+            <wp:extent cx="5029200" cy="2828925"/>
             <wp:docPr id="8" name="Picture 8"/>
             <wp:cNvGraphicFramePr>
               <a:graphicFrameLocks noChangeAspect="1"/>
@@ -2435,7 +3490,7 @@
                   <pic:spPr>
                     <a:xfrm>
                       <a:off x="0" y="0"/>
-                      <a:ext cx="4754880" cy="2674620"/>
+                      <a:ext cx="5029200" cy="2828925"/>
                     </a:xfrm>
                     <a:prstGeom prst="rect"/>
                   </pic:spPr>
@@ -2447,27 +3502,40 @@
       </w:r>
     </w:p>
     <w:p>
+      <w:pPr>
+        <w:spacing w:after="120"/>
+      </w:pPr>
+      <w:r/>
       <w:r>
-        <w:t>Figure: Clear class separation between M and B.</w:t>
+        <w:rPr>
+          <w:i/>
+        </w:rPr>
+        <w:t>Clear visual separation between Malignant and Benign clusters.</w:t>
       </w:r>
+      <w:r/>
     </w:p>
-    <w:p/>
     <w:p>
       <w:pPr>
-        <w:pStyle w:val="Heading2"/>
+        <w:spacing w:before="200" w:after="80"/>
       </w:pPr>
       <w:r>
-        <w:t>10.6 Heatmap — Correlations</w:t>
+        <w:rPr>
+          <w:b/>
+          <w:color w:val="2D3748"/>
+          <w:sz w:val="24"/>
+        </w:rPr>
+        <w:t>10.6 Heatmap — Feature Correlation Matrix</w:t>
       </w:r>
     </w:p>
     <w:p>
       <w:pPr>
+        <w:spacing w:after="240"/>
         <w:jc w:val="center"/>
       </w:pPr>
       <w:r>
         <w:drawing>
           <wp:inline xmlns:a="http://schemas.openxmlformats.org/drawingml/2006/main" xmlns:pic="http://schemas.openxmlformats.org/drawingml/2006/picture">
-            <wp:extent cx="4754880" cy="3396343"/>
+            <wp:extent cx="5029200" cy="3592286"/>
             <wp:docPr id="9" name="Picture 9"/>
             <wp:cNvGraphicFramePr>
               <a:graphicFrameLocks noChangeAspect="1"/>
@@ -2488,7 +3556,7 @@
                   <pic:spPr>
                     <a:xfrm>
                       <a:off x="0" y="0"/>
-                      <a:ext cx="4754880" cy="3396343"/>
+                      <a:ext cx="5029200" cy="3592286"/>
                     </a:xfrm>
                     <a:prstGeom prst="rect"/>
                   </pic:spPr>
@@ -2500,27 +3568,40 @@
       </w:r>
     </w:p>
     <w:p>
+      <w:pPr>
+        <w:spacing w:after="120"/>
+      </w:pPr>
+      <w:r/>
       <w:r>
-        <w:t>Figure: r &gt; 0.98 between geometric features.</w:t>
+        <w:rPr>
+          <w:i/>
+        </w:rPr>
+        <w:t>radius_mean, perimeter_mean, and area_mean are near-perfectly correlated (r &gt; 0.98), justifying feature removal.</w:t>
       </w:r>
+      <w:r/>
     </w:p>
-    <w:p/>
     <w:p>
       <w:pPr>
-        <w:pStyle w:val="Heading2"/>
+        <w:spacing w:before="200" w:after="80"/>
       </w:pPr>
       <w:r>
-        <w:t>10.7 Count Plot — Smoothness</w:t>
+        <w:rPr>
+          <w:b/>
+          <w:color w:val="2D3748"/>
+          <w:sz w:val="24"/>
+        </w:rPr>
+        <w:t>10.7 Count Plot — Smoothness Level by Diagnosis</w:t>
       </w:r>
     </w:p>
     <w:p>
       <w:pPr>
+        <w:spacing w:after="240"/>
         <w:jc w:val="center"/>
       </w:pPr>
       <w:r>
         <w:drawing>
           <wp:inline xmlns:a="http://schemas.openxmlformats.org/drawingml/2006/main" xmlns:pic="http://schemas.openxmlformats.org/drawingml/2006/picture">
-            <wp:extent cx="4754880" cy="2674620"/>
+            <wp:extent cx="5029200" cy="2828925"/>
             <wp:docPr id="10" name="Picture 10"/>
             <wp:cNvGraphicFramePr>
               <a:graphicFrameLocks noChangeAspect="1"/>
@@ -2541,7 +3622,7 @@
                   <pic:spPr>
                     <a:xfrm>
                       <a:off x="0" y="0"/>
-                      <a:ext cx="4754880" cy="2674620"/>
+                      <a:ext cx="5029200" cy="2828925"/>
                     </a:xfrm>
                     <a:prstGeom prst="rect"/>
                   </pic:spPr>
@@ -2553,27 +3634,40 @@
       </w:r>
     </w:p>
     <w:p>
+      <w:pPr>
+        <w:spacing w:after="120"/>
+      </w:pPr>
+      <w:r/>
       <w:r>
-        <w:t>Figure: High smoothness correlates with malignancy.</w:t>
+        <w:rPr>
+          <w:i/>
+        </w:rPr>
+        <w:t>Higher smoothness levels are more associated with malignant diagnosis.</w:t>
       </w:r>
+      <w:r/>
     </w:p>
-    <w:p/>
     <w:p>
       <w:pPr>
-        <w:pStyle w:val="Heading2"/>
+        <w:spacing w:before="200" w:after="80"/>
       </w:pPr>
       <w:r>
-        <w:t>10.8 Line Chart — Feature Profile</w:t>
+        <w:rPr>
+          <w:b/>
+          <w:color w:val="2D3748"/>
+          <w:sz w:val="24"/>
+        </w:rPr>
+        <w:t>10.8 Line Chart — Mean Feature Profile</w:t>
       </w:r>
     </w:p>
     <w:p>
       <w:pPr>
+        <w:spacing w:after="240"/>
         <w:jc w:val="center"/>
       </w:pPr>
       <w:r>
         <w:drawing>
           <wp:inline xmlns:a="http://schemas.openxmlformats.org/drawingml/2006/main" xmlns:pic="http://schemas.openxmlformats.org/drawingml/2006/picture">
-            <wp:extent cx="4754880" cy="2517289"/>
+            <wp:extent cx="5029200" cy="2662518"/>
             <wp:docPr id="11" name="Picture 11"/>
             <wp:cNvGraphicFramePr>
               <a:graphicFrameLocks noChangeAspect="1"/>
@@ -2594,7 +3688,7 @@
                   <pic:spPr>
                     <a:xfrm>
                       <a:off x="0" y="0"/>
-                      <a:ext cx="4754880" cy="2517289"/>
+                      <a:ext cx="5029200" cy="2662518"/>
                     </a:xfrm>
                     <a:prstGeom prst="rect"/>
                   </pic:spPr>
@@ -2606,118 +3700,403 @@
       </w:r>
     </w:p>
     <w:p>
+      <w:pPr>
+        <w:spacing w:after="120"/>
+      </w:pPr>
+      <w:r/>
       <w:r>
-        <w:t>Figure: M vs B mean feature comparison.</w:t>
+        <w:rPr>
+          <w:i/>
+        </w:rPr>
+        <w:t>Malignant class consistently higher across all mean features.</w:t>
+      </w:r>
+      <w:r/>
+    </w:p>
+    <w:p>
+      <w:pPr>
+        <w:spacing w:before="200" w:after="80"/>
+      </w:pPr>
+      <w:r>
+        <w:rPr>
+          <w:b/>
+          <w:color w:val="2D3748"/>
+          <w:sz w:val="24"/>
+        </w:rPr>
+        <w:t>10.9 Confusion Matrix</w:t>
       </w:r>
     </w:p>
-    <w:p/>
     <w:p>
       <w:pPr>
-        <w:pStyle w:val="Heading1"/>
+        <w:spacing w:after="240"/>
+        <w:jc w:val="center"/>
       </w:pPr>
       <w:r>
+        <w:drawing>
+          <wp:inline xmlns:a="http://schemas.openxmlformats.org/drawingml/2006/main" xmlns:pic="http://schemas.openxmlformats.org/drawingml/2006/picture">
+            <wp:extent cx="5029200" cy="4114800"/>
+            <wp:docPr id="12" name="Picture 12"/>
+            <wp:cNvGraphicFramePr>
+              <a:graphicFrameLocks noChangeAspect="1"/>
+            </wp:cNvGraphicFramePr>
+            <a:graphic>
+              <a:graphicData uri="http://schemas.openxmlformats.org/drawingml/2006/picture">
+                <pic:pic>
+                  <pic:nvPicPr>
+                    <pic:cNvPr id="0" name="09_confusion_matrix.png"/>
+                    <pic:cNvPicPr/>
+                  </pic:nvPicPr>
+                  <pic:blipFill>
+                    <a:blip r:embed="rId9"/>
+                    <a:stretch>
+                      <a:fillRect/>
+                    </a:stretch>
+                  </pic:blipFill>
+                  <pic:spPr>
+                    <a:xfrm>
+                      <a:off x="0" y="0"/>
+                      <a:ext cx="5029200" cy="4114800"/>
+                    </a:xfrm>
+                    <a:prstGeom prst="rect"/>
+                  </pic:spPr>
+                </pic:pic>
+              </a:graphicData>
+            </a:graphic>
+          </wp:inline>
+        </w:drawing>
+      </w:r>
+    </w:p>
+    <w:p>
+      <w:pPr>
+        <w:spacing w:after="120"/>
+      </w:pPr>
+      <w:r/>
+      <w:r>
+        <w:rPr>
+          <w:i/>
+        </w:rPr>
+        <w:t>Logistic Regression correctly classifies the majority of both classes.</w:t>
+      </w:r>
+      <w:r/>
+    </w:p>
+    <w:p>
+      <w:pPr>
+        <w:spacing w:before="200" w:after="80"/>
+      </w:pPr>
+      <w:r>
+        <w:rPr>
+          <w:b/>
+          <w:color w:val="2D3748"/>
+          <w:sz w:val="24"/>
+        </w:rPr>
+        <w:t>10.10 ROC Curve</w:t>
+      </w:r>
+    </w:p>
+    <w:p>
+      <w:pPr>
+        <w:spacing w:after="240"/>
+        <w:jc w:val="center"/>
+      </w:pPr>
+      <w:r>
+        <w:drawing>
+          <wp:inline xmlns:a="http://schemas.openxmlformats.org/drawingml/2006/main" xmlns:pic="http://schemas.openxmlformats.org/drawingml/2006/picture">
+            <wp:extent cx="5029200" cy="3918098"/>
+            <wp:docPr id="13" name="Picture 13"/>
+            <wp:cNvGraphicFramePr>
+              <a:graphicFrameLocks noChangeAspect="1"/>
+            </wp:cNvGraphicFramePr>
+            <a:graphic>
+              <a:graphicData uri="http://schemas.openxmlformats.org/drawingml/2006/picture">
+                <pic:pic>
+                  <pic:nvPicPr>
+                    <pic:cNvPr id="0" name="13_roc_curve.png"/>
+                    <pic:cNvPicPr/>
+                  </pic:nvPicPr>
+                  <pic:blipFill>
+                    <a:blip r:embed="rId11"/>
+                    <a:stretch>
+                      <a:fillRect/>
+                    </a:stretch>
+                  </pic:blipFill>
+                  <pic:spPr>
+                    <a:xfrm>
+                      <a:off x="0" y="0"/>
+                      <a:ext cx="5029200" cy="3918098"/>
+                    </a:xfrm>
+                    <a:prstGeom prst="rect"/>
+                  </pic:spPr>
+                </pic:pic>
+              </a:graphicData>
+            </a:graphic>
+          </wp:inline>
+        </w:drawing>
+      </w:r>
+    </w:p>
+    <w:p>
+      <w:pPr>
+        <w:spacing w:after="120"/>
+      </w:pPr>
+      <w:r/>
+      <w:r>
+        <w:rPr>
+          <w:i/>
+        </w:rPr>
+        <w:t>AUC = 0.9887 — outstanding discrimination capability.</w:t>
+      </w:r>
+      <w:r/>
+    </w:p>
+    <w:p>
+      <w:pPr>
+        <w:spacing w:before="280" w:after="120"/>
+      </w:pPr>
+      <w:r>
+        <w:rPr>
+          <w:b/>
+          <w:color w:val="2B6CB0"/>
+          <w:sz w:val="30"/>
+        </w:rPr>
         <w:t>11. Conclusions</w:t>
       </w:r>
     </w:p>
     <w:p>
       <w:pPr>
-        <w:pStyle w:val="ListNumber"/>
+        <w:spacing w:after="120"/>
       </w:pPr>
       <w:r>
-        <w:t>High Discriminatory Power: AUC = 0.9887 confirms near-perfect ability to distinguish Malignant from Benign tumors using only 7 features.</w:t>
+        <w:t xml:space="preserve">1. </w:t>
+      </w:r>
+      <w:r>
+        <w:rPr>
+          <w:b/>
+        </w:rPr>
+        <w:t>High Discriminatory Power:</w:t>
+      </w:r>
+      <w:r>
+        <w:t xml:space="preserve"> With AUC = 0.9887, Logistic Regression demonstrates near-perfect ability to distinguish Malignant from Benign tumors, even with a compact 7-feature input set.</w:t>
       </w:r>
     </w:p>
     <w:p>
       <w:pPr>
-        <w:pStyle w:val="ListNumber"/>
+        <w:spacing w:after="120"/>
       </w:pPr>
       <w:r>
-        <w:t>Feature Insights: concave points_mean and radius_mean are the strongest malignancy predictors; geometric redundancies (area, perimeter) were removed.</w:t>
+        <w:t xml:space="preserve">2. </w:t>
+      </w:r>
+      <w:r>
+        <w:rPr>
+          <w:b/>
+        </w:rPr>
+        <w:t>Feature Insights:</w:t>
+      </w:r>
+      <w:r>
+        <w:t xml:space="preserve"> </w:t>
+      </w:r>
+      <w:r>
+        <w:rPr>
+          <w:rFonts w:ascii="Consolas" w:hAnsi="Consolas"/>
+          <w:sz w:val="19"/>
+        </w:rPr>
+        <w:t>concave points_mean</w:t>
+      </w:r>
+      <w:r>
+        <w:t xml:space="preserve"> and </w:t>
+      </w:r>
+      <w:r>
+        <w:rPr>
+          <w:rFonts w:ascii="Consolas" w:hAnsi="Consolas"/>
+          <w:sz w:val="19"/>
+        </w:rPr>
+        <w:t>radius_mean</w:t>
+      </w:r>
+      <w:r>
+        <w:t xml:space="preserve"> are the strongest predictors of tumor malignancy. Geometric features (area, perimeter) were dropped due to redundancy.</w:t>
       </w:r>
     </w:p>
     <w:p>
       <w:pPr>
-        <w:pStyle w:val="ListNumber"/>
+        <w:spacing w:after="120"/>
       </w:pPr>
       <w:r>
-        <w:t>Clinical Relevance: The sigmoid probability output allows clinicians to set risk-based thresholds; AUC &gt; 0.98 makes this a reliable screening tool.</w:t>
+        <w:t xml:space="preserve">3. </w:t>
+      </w:r>
+      <w:r>
+        <w:rPr>
+          <w:b/>
+        </w:rPr>
+        <w:t>Clinical Relevance:</w:t>
+      </w:r>
+      <w:r>
+        <w:t xml:space="preserve"> The AUC-ROC of 0.9887 makes this model a reliable screening tool. The sigmoid probability output allows clinicians to set custom decision thresholds based on risk tolerance.</w:t>
       </w:r>
     </w:p>
     <w:p>
       <w:pPr>
-        <w:pStyle w:val="ListNumber"/>
+        <w:spacing w:after="120"/>
       </w:pPr>
       <w:r>
-        <w:t>Model Comparison: Random Forest leads raw accuracy (99.12%), but Logistic Regression offers interpretable coefficients — preferred for medical explainability.</w:t>
+        <w:t xml:space="preserve">4. </w:t>
+      </w:r>
+      <w:r>
+        <w:rPr>
+          <w:b/>
+        </w:rPr>
+        <w:t>Model Comparison:</w:t>
+      </w:r>
+      <w:r>
+        <w:t xml:space="preserve"> Random Forest achieved the highest raw accuracy (99.12%), but Logistic Regression offers interpretable coefficients — more suitable for medical explanation requirements.</w:t>
       </w:r>
     </w:p>
     <w:p>
       <w:pPr>
-        <w:pStyle w:val="ListNumber"/>
+        <w:spacing w:after="120"/>
       </w:pPr>
       <w:r>
-        <w:t>Limitations: Dataset was artificially augmented (duplicate rows); real-world clinical validation is required. Class imbalance (62.7% / 37.3%) biases accuracy.</w:t>
+        <w:t xml:space="preserve">5. </w:t>
+      </w:r>
+      <w:r>
+        <w:rPr>
+          <w:b/>
+        </w:rPr>
+        <w:t>Limitations:</w:t>
+      </w:r>
+      <w:r/>
+    </w:p>
+    <w:p>
+      <w:pPr>
+        <w:pStyle w:val="ListBullet"/>
+        <w:spacing w:after="60"/>
+      </w:pPr>
+      <w:r>
+        <w:t>Dataset was artificially augmented (duplicate rows) — not real independent patient data.</w:t>
       </w:r>
     </w:p>
     <w:p>
       <w:pPr>
-        <w:pStyle w:val="ListNumber"/>
+        <w:pStyle w:val="ListBullet"/>
+        <w:spacing w:after="60"/>
       </w:pPr>
       <w:r>
-        <w:t>Future Work: Apply SMOTE for imbalance correction; explore SVM and neural networks; incorporate _worst feature group for potentially higher recall.</w:t>
+        <w:t>Class imbalance (62.7% vs 37.3%) slightly biases accuracy metric.</w:t>
       </w:r>
     </w:p>
     <w:p>
       <w:pPr>
-        <w:pStyle w:val="Heading1"/>
+        <w:pStyle w:val="ListBullet"/>
+        <w:spacing w:after="60"/>
       </w:pPr>
       <w:r>
+        <w:t>Validation on real-world unseen clinical data is required before deployment.</w:t>
+      </w:r>
+    </w:p>
+    <w:p>
+      <w:pPr>
+        <w:spacing w:after="120"/>
+      </w:pPr>
+      <w:r>
+        <w:t xml:space="preserve">6. </w:t>
+      </w:r>
+      <w:r>
+        <w:rPr>
+          <w:b/>
+        </w:rPr>
+        <w:t>Future Work:</w:t>
+      </w:r>
+      <w:r>
+        <w:t xml:space="preserve"> Apply SMOTE for imbalance correction; explore SVM and neural network classifiers; use </w:t>
+      </w:r>
+      <w:r>
+        <w:rPr>
+          <w:rFonts w:ascii="Consolas" w:hAnsi="Consolas"/>
+          <w:sz w:val="19"/>
+        </w:rPr>
+        <w:t>_worst</w:t>
+      </w:r>
+      <w:r>
+        <w:t xml:space="preserve"> feature group for potentially higher recall on malignant cases.</w:t>
+      </w:r>
+    </w:p>
+    <w:p>
+      <w:pPr>
+        <w:spacing w:before="280" w:after="120"/>
+      </w:pPr>
+      <w:r>
+        <w:rPr>
+          <w:b/>
+          <w:color w:val="2B6CB0"/>
+          <w:sz w:val="30"/>
+        </w:rPr>
         <w:t>12. References</w:t>
       </w:r>
     </w:p>
     <w:p>
       <w:pPr>
-        <w:pStyle w:val="ListNumber"/>
+        <w:spacing w:after="120"/>
       </w:pPr>
       <w:r>
-        <w:t>1. Kaggle Breast Cancer Dataset: https://www.kaggle.com/datasets/mehmetisik/breast-cancercsv</w:t>
+        <w:t>1. Kaggle Breast Cancer Dataset: [https://www.kaggle.com/datasets/mehmetisik/breast-cancercsv](https://www.kaggle.com/datasets/mehmetisik/breast-cancercsv)</w:t>
       </w:r>
     </w:p>
     <w:p>
       <w:pPr>
-        <w:pStyle w:val="ListNumber"/>
+        <w:spacing w:after="120"/>
       </w:pPr>
       <w:r>
-        <w:t>2. Street, W. N., Wolberg, W. H., &amp; Mangasarian, O. L. (1993). Nuclear feature extraction for breast tumor diagnosis. IS&amp;T/SPIE, Vol. 1905.</w:t>
+        <w:t xml:space="preserve">2. Street, W. N., Wolberg, W. H., &amp; Mangasarian, O. L. (1993). </w:t>
+      </w:r>
+      <w:r>
+        <w:rPr>
+          <w:i/>
+        </w:rPr>
+        <w:t>Nuclear feature extraction for breast tumor diagnosis</w:t>
+      </w:r>
+      <w:r>
+        <w:t>. IS&amp;T/SPIE's Symposium on Electronic Imaging, Vol. 1905.</w:t>
       </w:r>
     </w:p>
     <w:p>
       <w:pPr>
-        <w:pStyle w:val="ListNumber"/>
+        <w:spacing w:after="120"/>
       </w:pPr>
       <w:r>
-        <w:t>3. Pedregosa, F., et al. (2011). Scikit-learn: Machine Learning in Python. JMLR, 12, 2825–2830.</w:t>
+        <w:t xml:space="preserve">3. Pedregosa, F., et al. (2011). </w:t>
+      </w:r>
+      <w:r>
+        <w:rPr>
+          <w:i/>
+        </w:rPr>
+        <w:t>Scikit-learn: Machine Learning in Python</w:t>
+      </w:r>
+      <w:r>
+        <w:t>. Journal of Machine Learning Research, 12, 2825–2830.</w:t>
       </w:r>
     </w:p>
     <w:p>
       <w:pPr>
-        <w:pStyle w:val="ListNumber"/>
+        <w:spacing w:after="120"/>
       </w:pPr>
       <w:r>
-        <w:t>4. Bishop, C. M. (2006). Pattern Recognition and Machine Learning. Springer.</w:t>
+        <w:t xml:space="preserve">4. Bishop, C. M. (2006). </w:t>
+      </w:r>
+      <w:r>
+        <w:rPr>
+          <w:i/>
+        </w:rPr>
+        <w:t>Pattern Recognition and Machine Learning</w:t>
+      </w:r>
+      <w:r>
+        <w:t>. Springer.</w:t>
       </w:r>
     </w:p>
     <w:p>
       <w:pPr>
-        <w:pStyle w:val="ListNumber"/>
+        <w:spacing w:after="120"/>
       </w:pPr>
       <w:r>
-        <w:t>5. Seaborn Documentation: https://seaborn.pydata.org</w:t>
+        <w:t>5. Seaborn Documentation: [https://seaborn.pydata.org](https://seaborn.pydata.org)</w:t>
       </w:r>
     </w:p>
     <w:sectPr>
       <w:pgSz w:w="12240" w:h="15840"/>
-      <w:pgMar w:top="1417" w:right="1587" w:bottom="1417" w:left="1587" w:header="720" w:footer="720" w:gutter="0"/>
+      <w:pgMar w:top="1440" w:right="1440" w:bottom="1440" w:left="1440" w:header="720" w:footer="720" w:gutter="0"/>
       <w:cols w:space="720"/>
       <w:docGrid w:linePitch="360"/>
     </w:sectPr>
@@ -3088,6 +4467,11 @@
     <w:name w:val="Normal"/>
     <w:qFormat/>
     <w:rsid w:val="00FC693F"/>
+    <w:rPr>
+      <w:rFonts w:ascii="Calibri" w:hAnsi="Calibri"/>
+      <w:color w:val="222222"/>
+      <w:sz w:val="22"/>
+    </w:rPr>
   </w:style>
   <w:style w:type="paragraph" w:styleId="Header">
     <w:name w:val="header"/>
@@ -3151,8 +4535,8 @@
       <w:rFonts w:asciiTheme="majorHAnsi" w:eastAsiaTheme="majorEastAsia" w:hAnsiTheme="majorHAnsi" w:cstheme="majorBidi"/>
       <w:b/>
       <w:bCs/>
-      <w:color w:val="1A5376"/>
-      <w:sz w:val="36"/>
+      <w:color w:val="365F91" w:themeColor="accent1" w:themeShade="BF"/>
+      <w:sz w:val="28"/>
       <w:szCs w:val="28"/>
     </w:rPr>
   </w:style>
@@ -3175,8 +4559,8 @@
       <w:rFonts w:asciiTheme="majorHAnsi" w:eastAsiaTheme="majorEastAsia" w:hAnsiTheme="majorHAnsi" w:cstheme="majorBidi"/>
       <w:b/>
       <w:bCs/>
-      <w:color w:val="1F77B4"/>
-      <w:sz w:val="28"/>
+      <w:color w:val="4F81BD" w:themeColor="accent1"/>
+      <w:sz w:val="26"/>
       <w:szCs w:val="26"/>
     </w:rPr>
   </w:style>
@@ -3199,8 +4583,7 @@
       <w:rFonts w:asciiTheme="majorHAnsi" w:eastAsiaTheme="majorEastAsia" w:hAnsiTheme="majorHAnsi" w:cstheme="majorBidi"/>
       <w:b/>
       <w:bCs/>
-      <w:color w:val="2CA02C"/>
-      <w:sz w:val="24"/>
+      <w:color w:val="4F81BD" w:themeColor="accent1"/>
     </w:rPr>
   </w:style>
   <w:style w:type="paragraph" w:styleId="Heading4">

</xml_diff>

<commit_message>
feat: regenerate all 14 publication-quality figures at 300 DPI for DS_LAB_REPORT.md
</commit_message>
<xml_diff>
--- a/DS_LAB_REPORT.docx
+++ b/DS_LAB_REPORT.docx
@@ -2566,7 +2566,7 @@
       <w:r>
         <w:drawing>
           <wp:inline xmlns:a="http://schemas.openxmlformats.org/drawingml/2006/main" xmlns:pic="http://schemas.openxmlformats.org/drawingml/2006/picture">
-            <wp:extent cx="5029200" cy="4114800"/>
+            <wp:extent cx="5029200" cy="4191000"/>
             <wp:docPr id="1" name="Picture 1"/>
             <wp:cNvGraphicFramePr>
               <a:graphicFrameLocks noChangeAspect="1"/>
@@ -2587,7 +2587,7 @@
                   <pic:spPr>
                     <a:xfrm>
                       <a:off x="0" y="0"/>
-                      <a:ext cx="5029200" cy="4114800"/>
+                      <a:ext cx="5029200" cy="4191000"/>
                     </a:xfrm>
                     <a:prstGeom prst="rect"/>
                   </pic:spPr>
@@ -2685,7 +2685,7 @@
       <w:r>
         <w:drawing>
           <wp:inline xmlns:a="http://schemas.openxmlformats.org/drawingml/2006/main" xmlns:pic="http://schemas.openxmlformats.org/drawingml/2006/picture">
-            <wp:extent cx="5029200" cy="3074342"/>
+            <wp:extent cx="5029200" cy="2958353"/>
             <wp:docPr id="2" name="Picture 2"/>
             <wp:cNvGraphicFramePr>
               <a:graphicFrameLocks noChangeAspect="1"/>
@@ -2706,7 +2706,7 @@
                   <pic:spPr>
                     <a:xfrm>
                       <a:off x="0" y="0"/>
-                      <a:ext cx="5029200" cy="3074342"/>
+                      <a:ext cx="5029200" cy="2958353"/>
                     </a:xfrm>
                     <a:prstGeom prst="rect"/>
                   </pic:spPr>
@@ -3000,7 +3000,7 @@
       <w:r>
         <w:drawing>
           <wp:inline xmlns:a="http://schemas.openxmlformats.org/drawingml/2006/main" xmlns:pic="http://schemas.openxmlformats.org/drawingml/2006/picture">
-            <wp:extent cx="5029200" cy="3918098"/>
+            <wp:extent cx="5029200" cy="3951514"/>
             <wp:docPr id="3" name="Picture 3"/>
             <wp:cNvGraphicFramePr>
               <a:graphicFrameLocks noChangeAspect="1"/>
@@ -3021,7 +3021,7 @@
                   <pic:spPr>
                     <a:xfrm>
                       <a:off x="0" y="0"/>
-                      <a:ext cx="5029200" cy="3918098"/>
+                      <a:ext cx="5029200" cy="3951514"/>
                     </a:xfrm>
                     <a:prstGeom prst="rect"/>
                   </pic:spPr>
@@ -3205,7 +3205,7 @@
       <w:r>
         <w:drawing>
           <wp:inline xmlns:a="http://schemas.openxmlformats.org/drawingml/2006/main" xmlns:pic="http://schemas.openxmlformats.org/drawingml/2006/picture">
-            <wp:extent cx="5029200" cy="3233057"/>
+            <wp:extent cx="5029200" cy="3448594"/>
             <wp:docPr id="4" name="Picture 4"/>
             <wp:cNvGraphicFramePr>
               <a:graphicFrameLocks noChangeAspect="1"/>
@@ -3226,7 +3226,7 @@
                   <pic:spPr>
                     <a:xfrm>
                       <a:off x="0" y="0"/>
-                      <a:ext cx="5029200" cy="3233057"/>
+                      <a:ext cx="5029200" cy="3448594"/>
                     </a:xfrm>
                     <a:prstGeom prst="rect"/>
                   </pic:spPr>
@@ -3271,7 +3271,7 @@
       <w:r>
         <w:drawing>
           <wp:inline xmlns:a="http://schemas.openxmlformats.org/drawingml/2006/main" xmlns:pic="http://schemas.openxmlformats.org/drawingml/2006/picture">
-            <wp:extent cx="5029200" cy="5029200"/>
+            <wp:extent cx="5029200" cy="4610100"/>
             <wp:docPr id="5" name="Picture 5"/>
             <wp:cNvGraphicFramePr>
               <a:graphicFrameLocks noChangeAspect="1"/>
@@ -3292,7 +3292,7 @@
                   <pic:spPr>
                     <a:xfrm>
                       <a:off x="0" y="0"/>
-                      <a:ext cx="5029200" cy="5029200"/>
+                      <a:ext cx="5029200" cy="4610100"/>
                     </a:xfrm>
                     <a:prstGeom prst="rect"/>
                   </pic:spPr>
@@ -3337,7 +3337,7 @@
       <w:r>
         <w:drawing>
           <wp:inline xmlns:a="http://schemas.openxmlformats.org/drawingml/2006/main" xmlns:pic="http://schemas.openxmlformats.org/drawingml/2006/picture">
-            <wp:extent cx="5029200" cy="2828925"/>
+            <wp:extent cx="5029200" cy="3143250"/>
             <wp:docPr id="6" name="Picture 6"/>
             <wp:cNvGraphicFramePr>
               <a:graphicFrameLocks noChangeAspect="1"/>
@@ -3358,7 +3358,7 @@
                   <pic:spPr>
                     <a:xfrm>
                       <a:off x="0" y="0"/>
-                      <a:ext cx="5029200" cy="2828925"/>
+                      <a:ext cx="5029200" cy="3143250"/>
                     </a:xfrm>
                     <a:prstGeom prst="rect"/>
                   </pic:spPr>
@@ -3403,7 +3403,7 @@
       <w:r>
         <w:drawing>
           <wp:inline xmlns:a="http://schemas.openxmlformats.org/drawingml/2006/main" xmlns:pic="http://schemas.openxmlformats.org/drawingml/2006/picture">
-            <wp:extent cx="5029200" cy="3017520"/>
+            <wp:extent cx="5029200" cy="3352800"/>
             <wp:docPr id="7" name="Picture 7"/>
             <wp:cNvGraphicFramePr>
               <a:graphicFrameLocks noChangeAspect="1"/>
@@ -3424,7 +3424,7 @@
                   <pic:spPr>
                     <a:xfrm>
                       <a:off x="0" y="0"/>
-                      <a:ext cx="5029200" cy="3017520"/>
+                      <a:ext cx="5029200" cy="3352800"/>
                     </a:xfrm>
                     <a:prstGeom prst="rect"/>
                   </pic:spPr>
@@ -3469,7 +3469,7 @@
       <w:r>
         <w:drawing>
           <wp:inline xmlns:a="http://schemas.openxmlformats.org/drawingml/2006/main" xmlns:pic="http://schemas.openxmlformats.org/drawingml/2006/picture">
-            <wp:extent cx="5029200" cy="2828925"/>
+            <wp:extent cx="5029200" cy="3143250"/>
             <wp:docPr id="8" name="Picture 8"/>
             <wp:cNvGraphicFramePr>
               <a:graphicFrameLocks noChangeAspect="1"/>
@@ -3490,7 +3490,7 @@
                   <pic:spPr>
                     <a:xfrm>
                       <a:off x="0" y="0"/>
-                      <a:ext cx="5029200" cy="2828925"/>
+                      <a:ext cx="5029200" cy="3143250"/>
                     </a:xfrm>
                     <a:prstGeom prst="rect"/>
                   </pic:spPr>
@@ -3535,7 +3535,7 @@
       <w:r>
         <w:drawing>
           <wp:inline xmlns:a="http://schemas.openxmlformats.org/drawingml/2006/main" xmlns:pic="http://schemas.openxmlformats.org/drawingml/2006/picture">
-            <wp:extent cx="5029200" cy="3592286"/>
+            <wp:extent cx="5029200" cy="3845859"/>
             <wp:docPr id="9" name="Picture 9"/>
             <wp:cNvGraphicFramePr>
               <a:graphicFrameLocks noChangeAspect="1"/>
@@ -3556,7 +3556,7 @@
                   <pic:spPr>
                     <a:xfrm>
                       <a:off x="0" y="0"/>
-                      <a:ext cx="5029200" cy="3592286"/>
+                      <a:ext cx="5029200" cy="3845859"/>
                     </a:xfrm>
                     <a:prstGeom prst="rect"/>
                   </pic:spPr>
@@ -3601,7 +3601,7 @@
       <w:r>
         <w:drawing>
           <wp:inline xmlns:a="http://schemas.openxmlformats.org/drawingml/2006/main" xmlns:pic="http://schemas.openxmlformats.org/drawingml/2006/picture">
-            <wp:extent cx="5029200" cy="2828925"/>
+            <wp:extent cx="5029200" cy="3218688"/>
             <wp:docPr id="10" name="Picture 10"/>
             <wp:cNvGraphicFramePr>
               <a:graphicFrameLocks noChangeAspect="1"/>
@@ -3622,7 +3622,7 @@
                   <pic:spPr>
                     <a:xfrm>
                       <a:off x="0" y="0"/>
-                      <a:ext cx="5029200" cy="2828925"/>
+                      <a:ext cx="5029200" cy="3218688"/>
                     </a:xfrm>
                     <a:prstGeom prst="rect"/>
                   </pic:spPr>
@@ -3667,7 +3667,7 @@
       <w:r>
         <w:drawing>
           <wp:inline xmlns:a="http://schemas.openxmlformats.org/drawingml/2006/main" xmlns:pic="http://schemas.openxmlformats.org/drawingml/2006/picture">
-            <wp:extent cx="5029200" cy="2662518"/>
+            <wp:extent cx="5029200" cy="2682240"/>
             <wp:docPr id="11" name="Picture 11"/>
             <wp:cNvGraphicFramePr>
               <a:graphicFrameLocks noChangeAspect="1"/>
@@ -3688,7 +3688,7 @@
                   <pic:spPr>
                     <a:xfrm>
                       <a:off x="0" y="0"/>
-                      <a:ext cx="5029200" cy="2662518"/>
+                      <a:ext cx="5029200" cy="2682240"/>
                     </a:xfrm>
                     <a:prstGeom prst="rect"/>
                   </pic:spPr>
@@ -3733,7 +3733,7 @@
       <w:r>
         <w:drawing>
           <wp:inline xmlns:a="http://schemas.openxmlformats.org/drawingml/2006/main" xmlns:pic="http://schemas.openxmlformats.org/drawingml/2006/picture">
-            <wp:extent cx="5029200" cy="4114800"/>
+            <wp:extent cx="5029200" cy="4191000"/>
             <wp:docPr id="12" name="Picture 12"/>
             <wp:cNvGraphicFramePr>
               <a:graphicFrameLocks noChangeAspect="1"/>
@@ -3754,7 +3754,7 @@
                   <pic:spPr>
                     <a:xfrm>
                       <a:off x="0" y="0"/>
-                      <a:ext cx="5029200" cy="4114800"/>
+                      <a:ext cx="5029200" cy="4191000"/>
                     </a:xfrm>
                     <a:prstGeom prst="rect"/>
                   </pic:spPr>
@@ -3799,7 +3799,7 @@
       <w:r>
         <w:drawing>
           <wp:inline xmlns:a="http://schemas.openxmlformats.org/drawingml/2006/main" xmlns:pic="http://schemas.openxmlformats.org/drawingml/2006/picture">
-            <wp:extent cx="5029200" cy="3918098"/>
+            <wp:extent cx="5029200" cy="3951514"/>
             <wp:docPr id="13" name="Picture 13"/>
             <wp:cNvGraphicFramePr>
               <a:graphicFrameLocks noChangeAspect="1"/>
@@ -3820,7 +3820,7 @@
                   <pic:spPr>
                     <a:xfrm>
                       <a:off x="0" y="0"/>
-                      <a:ext cx="5029200" cy="3918098"/>
+                      <a:ext cx="5029200" cy="3951514"/>
                     </a:xfrm>
                     <a:prstGeom prst="rect"/>
                   </pic:spPr>

</xml_diff>